<commit_message>
Deploying to gh-pages from @ rhenoa24/Resume2025@cc85a49f332e1ccc3b8347c21f5261d5a170d4d7 🚀
</commit_message>
<xml_diff>
--- a/Pajaro_Resume_2026.docx
+++ b/Pajaro_Resume_2026.docx
@@ -306,8 +306,8 @@
                 <w:rStyle w:val="Hyperlink"/>
                 <w:rFonts w:ascii="Inter" w:hAnsi="Inter"/>
                 <w:color w:val="auto"/>
-                <w:sz w:val="20"/>
-                <w:szCs w:val="20"/>
+                <w:sz w:val="18"/>
+                <w:szCs w:val="18"/>
                 <w:u w:val="none"/>
               </w:rPr>
             </w:pPr>
@@ -316,8 +316,8 @@
                 <w:rStyle w:val="Hyperlink"/>
                 <w:rFonts w:ascii="Inter" w:hAnsi="Inter"/>
                 <w:color w:val="auto"/>
-                <w:sz w:val="20"/>
-                <w:szCs w:val="20"/>
+                <w:sz w:val="18"/>
+                <w:szCs w:val="18"/>
                 <w:u w:val="none"/>
               </w:rPr>
               <w:fldChar w:fldCharType="begin"/>
@@ -327,8 +327,8 @@
                 <w:rStyle w:val="Hyperlink"/>
                 <w:rFonts w:ascii="Inter" w:hAnsi="Inter"/>
                 <w:color w:val="auto"/>
-                <w:sz w:val="20"/>
-                <w:szCs w:val="20"/>
+                <w:sz w:val="18"/>
+                <w:szCs w:val="18"/>
                 <w:u w:val="none"/>
               </w:rPr>
               <w:instrText>HYPERLINK "tel:+639052583624"</w:instrText>
@@ -338,8 +338,8 @@
                 <w:rStyle w:val="Hyperlink"/>
                 <w:rFonts w:ascii="Inter" w:hAnsi="Inter"/>
                 <w:color w:val="auto"/>
-                <w:sz w:val="20"/>
-                <w:szCs w:val="20"/>
+                <w:sz w:val="18"/>
+                <w:szCs w:val="18"/>
                 <w:u w:val="none"/>
               </w:rPr>
             </w:r>
@@ -348,8 +348,8 @@
                 <w:rStyle w:val="Hyperlink"/>
                 <w:rFonts w:ascii="Inter" w:hAnsi="Inter"/>
                 <w:color w:val="auto"/>
-                <w:sz w:val="20"/>
-                <w:szCs w:val="20"/>
+                <w:sz w:val="18"/>
+                <w:szCs w:val="18"/>
                 <w:u w:val="none"/>
               </w:rPr>
               <w:fldChar w:fldCharType="separate"/>
@@ -359,8 +359,8 @@
                 <w:rStyle w:val="Hyperlink"/>
                 <w:rFonts w:ascii="Inter" w:hAnsi="Inter"/>
                 <w:color w:val="auto"/>
-                <w:sz w:val="20"/>
-                <w:szCs w:val="20"/>
+                <w:sz w:val="18"/>
+                <w:szCs w:val="18"/>
                 <w:u w:val="none"/>
               </w:rPr>
               <w:t>+63</w:t>
@@ -370,8 +370,8 @@
                 <w:rStyle w:val="Hyperlink"/>
                 <w:rFonts w:ascii="Inter" w:hAnsi="Inter"/>
                 <w:color w:val="auto"/>
-                <w:sz w:val="20"/>
-                <w:szCs w:val="20"/>
+                <w:sz w:val="18"/>
+                <w:szCs w:val="18"/>
                 <w:u w:val="none"/>
               </w:rPr>
               <w:t xml:space="preserve"> 9</w:t>
@@ -381,41 +381,36 @@
                 <w:rStyle w:val="Hyperlink"/>
                 <w:rFonts w:ascii="Inter" w:hAnsi="Inter"/>
                 <w:color w:val="auto"/>
-                <w:sz w:val="20"/>
-                <w:szCs w:val="20"/>
+                <w:sz w:val="18"/>
+                <w:szCs w:val="18"/>
                 <w:u w:val="none"/>
               </w:rPr>
-              <w:t>0</w:t>
-            </w:r>
+              <w:t>05-258-3624</w:t>
+            </w:r>
+          </w:p>
+          <w:p>
+            <w:pPr>
+              <w:rPr>
+                <w:sz w:val="22"/>
+                <w:szCs w:val="22"/>
+              </w:rPr>
+            </w:pPr>
             <w:r>
               <w:rPr>
                 <w:rStyle w:val="Hyperlink"/>
                 <w:rFonts w:ascii="Inter" w:hAnsi="Inter"/>
                 <w:color w:val="auto"/>
-                <w:sz w:val="20"/>
-                <w:szCs w:val="20"/>
+                <w:sz w:val="18"/>
+                <w:szCs w:val="18"/>
                 <w:u w:val="none"/>
               </w:rPr>
-              <w:t>5-258-3624</w:t>
-            </w:r>
-          </w:p>
-          <w:p>
-            <w:r>
-              <w:rPr>
-                <w:rStyle w:val="Hyperlink"/>
-                <w:rFonts w:ascii="Inter" w:hAnsi="Inter"/>
-                <w:color w:val="auto"/>
-                <w:sz w:val="20"/>
-                <w:szCs w:val="20"/>
-                <w:u w:val="none"/>
-              </w:rPr>
               <w:fldChar w:fldCharType="end"/>
             </w:r>
             <w:r>
               <w:rPr>
                 <w:rFonts w:ascii="Inter" w:hAnsi="Inter"/>
-                <w:sz w:val="20"/>
-                <w:szCs w:val="20"/>
+                <w:sz w:val="18"/>
+                <w:szCs w:val="18"/>
               </w:rPr>
               <w:t>Antipolo City, Rizal</w:t>
             </w:r>
@@ -567,8 +562,8 @@
                 <w:rFonts w:ascii="Inter" w:hAnsi="Inter"/>
                 <w:b/>
                 <w:bCs/>
-                <w:sz w:val="20"/>
-                <w:szCs w:val="20"/>
+                <w:sz w:val="18"/>
+                <w:szCs w:val="18"/>
               </w:rPr>
             </w:pPr>
             <w:r>
@@ -576,8 +571,8 @@
                 <w:rFonts w:ascii="Inter" w:hAnsi="Inter"/>
                 <w:b/>
                 <w:bCs/>
-                <w:sz w:val="20"/>
-                <w:szCs w:val="20"/>
+                <w:sz w:val="18"/>
+                <w:szCs w:val="18"/>
               </w:rPr>
               <w:t xml:space="preserve">Bachelor of Science in Computer </w:t>
             </w:r>
@@ -586,8 +581,8 @@
                 <w:rFonts w:ascii="Inter" w:hAnsi="Inter"/>
                 <w:b/>
                 <w:bCs/>
-                <w:sz w:val="20"/>
-                <w:szCs w:val="20"/>
+                <w:sz w:val="18"/>
+                <w:szCs w:val="18"/>
               </w:rPr>
               <w:t>Science</w:t>
             </w:r>
@@ -596,41 +591,25 @@
             <w:pPr>
               <w:rPr>
                 <w:rFonts w:ascii="Inter" w:hAnsi="Inter"/>
-                <w:sz w:val="20"/>
-                <w:szCs w:val="20"/>
+                <w:sz w:val="18"/>
+                <w:szCs w:val="18"/>
               </w:rPr>
             </w:pPr>
             <w:proofErr w:type="spellStart"/>
             <w:r>
               <w:rPr>
                 <w:rFonts w:ascii="Inter" w:hAnsi="Inter"/>
-                <w:sz w:val="20"/>
-                <w:szCs w:val="20"/>
-              </w:rPr>
-              <w:t>Map</w:t>
-            </w:r>
-            <w:r>
-              <w:rPr>
-                <w:rFonts w:ascii="Inter" w:hAnsi="Inter"/>
-                <w:sz w:val="20"/>
-                <w:szCs w:val="20"/>
-              </w:rPr>
-              <w:t>ú</w:t>
-            </w:r>
-            <w:r>
-              <w:rPr>
-                <w:rFonts w:ascii="Inter" w:hAnsi="Inter"/>
-                <w:sz w:val="20"/>
-                <w:szCs w:val="20"/>
-              </w:rPr>
-              <w:t>a</w:t>
+                <w:sz w:val="18"/>
+                <w:szCs w:val="18"/>
+              </w:rPr>
+              <w:t>Mapúa</w:t>
             </w:r>
             <w:proofErr w:type="spellEnd"/>
             <w:r>
               <w:rPr>
                 <w:rFonts w:ascii="Inter" w:hAnsi="Inter"/>
-                <w:sz w:val="20"/>
-                <w:szCs w:val="20"/>
+                <w:sz w:val="18"/>
+                <w:szCs w:val="18"/>
               </w:rPr>
               <w:t xml:space="preserve"> University</w:t>
             </w:r>
@@ -639,23 +618,23 @@
             <w:pPr>
               <w:rPr>
                 <w:rFonts w:ascii="Inter" w:hAnsi="Inter"/>
-                <w:sz w:val="20"/>
-                <w:szCs w:val="20"/>
-              </w:rPr>
-            </w:pPr>
-            <w:r>
-              <w:rPr>
-                <w:rFonts w:ascii="Inter" w:hAnsi="Inter"/>
-                <w:sz w:val="20"/>
-                <w:szCs w:val="20"/>
+                <w:sz w:val="18"/>
+                <w:szCs w:val="18"/>
+              </w:rPr>
+            </w:pPr>
+            <w:r>
+              <w:rPr>
+                <w:rFonts w:ascii="Inter" w:hAnsi="Inter"/>
+                <w:sz w:val="18"/>
+                <w:szCs w:val="18"/>
               </w:rPr>
               <w:t>2018-202</w:t>
             </w:r>
             <w:r>
               <w:rPr>
                 <w:rFonts w:ascii="Inter" w:hAnsi="Inter"/>
-                <w:sz w:val="20"/>
-                <w:szCs w:val="20"/>
+                <w:sz w:val="18"/>
+                <w:szCs w:val="18"/>
               </w:rPr>
               <w:t>4</w:t>
             </w:r>
@@ -789,11 +768,324 @@
                 <w:rFonts w:ascii="Inter" w:hAnsi="Inter"/>
                 <w:b/>
                 <w:bCs/>
-                <w:sz w:val="20"/>
-                <w:szCs w:val="20"/>
-              </w:rPr>
-            </w:pPr>
-            <w:r>
+                <w:sz w:val="18"/>
+                <w:szCs w:val="18"/>
+              </w:rPr>
+            </w:pPr>
+            <w:r>
+              <w:rPr>
+                <w:rFonts w:ascii="Inter" w:hAnsi="Inter"/>
+                <w:b/>
+                <w:bCs/>
+                <w:sz w:val="18"/>
+                <w:szCs w:val="18"/>
+              </w:rPr>
+              <w:t>Programming Languages &amp; Scripting</w:t>
+            </w:r>
+          </w:p>
+          <w:p>
+            <w:pPr>
+              <w:rPr>
+                <w:rFonts w:ascii="Inter" w:hAnsi="Inter"/>
+                <w:sz w:val="18"/>
+                <w:szCs w:val="18"/>
+              </w:rPr>
+            </w:pPr>
+            <w:r>
+              <w:rPr>
+                <w:rFonts w:ascii="Inter" w:hAnsi="Inter"/>
+                <w:sz w:val="18"/>
+                <w:szCs w:val="18"/>
+              </w:rPr>
+              <w:t>TypeScript, C#, Python, JavaScript</w:t>
+            </w:r>
+          </w:p>
+          <w:p>
+            <w:pPr>
+              <w:rPr>
+                <w:rFonts w:ascii="Inter" w:hAnsi="Inter"/>
+                <w:sz w:val="18"/>
+                <w:szCs w:val="18"/>
+              </w:rPr>
+            </w:pPr>
+          </w:p>
+          <w:p>
+            <w:pPr>
+              <w:rPr>
+                <w:rFonts w:ascii="Inter" w:hAnsi="Inter"/>
+                <w:b/>
+                <w:bCs/>
+                <w:sz w:val="18"/>
+                <w:szCs w:val="18"/>
+              </w:rPr>
+            </w:pPr>
+            <w:r>
+              <w:rPr>
+                <w:rFonts w:ascii="Inter" w:hAnsi="Inter"/>
+                <w:b/>
+                <w:bCs/>
+                <w:sz w:val="18"/>
+                <w:szCs w:val="18"/>
+              </w:rPr>
+              <w:t>Web Development &amp; Frontend</w:t>
+            </w:r>
+          </w:p>
+          <w:p>
+            <w:pPr>
+              <w:rPr>
+                <w:rFonts w:ascii="Inter" w:hAnsi="Inter"/>
+                <w:sz w:val="18"/>
+                <w:szCs w:val="18"/>
+              </w:rPr>
+            </w:pPr>
+            <w:r>
+              <w:rPr>
+                <w:rFonts w:ascii="Inter" w:hAnsi="Inter"/>
+                <w:sz w:val="18"/>
+                <w:szCs w:val="18"/>
+              </w:rPr>
+              <w:t>Angular Framework, HTML5, CSS3/SCSS</w:t>
+            </w:r>
+          </w:p>
+          <w:p>
+            <w:pPr>
+              <w:rPr>
+                <w:rFonts w:ascii="Inter" w:hAnsi="Inter"/>
+                <w:sz w:val="18"/>
+                <w:szCs w:val="18"/>
+              </w:rPr>
+            </w:pPr>
+          </w:p>
+          <w:p>
+            <w:pPr>
+              <w:rPr>
+                <w:rFonts w:ascii="Inter" w:hAnsi="Inter"/>
+                <w:b/>
+                <w:bCs/>
+                <w:sz w:val="18"/>
+                <w:szCs w:val="18"/>
+              </w:rPr>
+            </w:pPr>
+            <w:r>
+              <w:rPr>
+                <w:rFonts w:ascii="Inter" w:hAnsi="Inter"/>
+                <w:b/>
+                <w:bCs/>
+                <w:sz w:val="18"/>
+                <w:szCs w:val="18"/>
+              </w:rPr>
+              <w:t>Backend &amp; Server-Side</w:t>
+            </w:r>
+          </w:p>
+          <w:p>
+            <w:pPr>
+              <w:rPr>
+                <w:rFonts w:ascii="Inter" w:hAnsi="Inter"/>
+                <w:sz w:val="18"/>
+                <w:szCs w:val="18"/>
+              </w:rPr>
+            </w:pPr>
+            <w:r>
+              <w:rPr>
+                <w:rFonts w:ascii="Inter" w:hAnsi="Inter"/>
+                <w:sz w:val="18"/>
+                <w:szCs w:val="18"/>
+              </w:rPr>
+              <w:t>C#, .NET, Azure SQL</w:t>
+            </w:r>
+          </w:p>
+          <w:p>
+            <w:pPr>
+              <w:rPr>
+                <w:rFonts w:ascii="Inter" w:hAnsi="Inter"/>
+                <w:sz w:val="18"/>
+                <w:szCs w:val="18"/>
+              </w:rPr>
+            </w:pPr>
+          </w:p>
+          <w:p>
+            <w:pPr>
+              <w:rPr>
+                <w:rFonts w:ascii="Inter" w:hAnsi="Inter"/>
+                <w:b/>
+                <w:bCs/>
+                <w:sz w:val="18"/>
+                <w:szCs w:val="18"/>
+              </w:rPr>
+            </w:pPr>
+            <w:r>
+              <w:rPr>
+                <w:rFonts w:ascii="Inter" w:hAnsi="Inter"/>
+                <w:b/>
+                <w:bCs/>
+                <w:sz w:val="18"/>
+                <w:szCs w:val="18"/>
+              </w:rPr>
+              <w:t>Databases</w:t>
+            </w:r>
+          </w:p>
+          <w:p>
+            <w:pPr>
+              <w:rPr>
+                <w:rFonts w:ascii="Inter" w:hAnsi="Inter"/>
+                <w:sz w:val="18"/>
+                <w:szCs w:val="18"/>
+              </w:rPr>
+            </w:pPr>
+            <w:r>
+              <w:rPr>
+                <w:rFonts w:ascii="Inter" w:hAnsi="Inter"/>
+                <w:sz w:val="18"/>
+                <w:szCs w:val="18"/>
+              </w:rPr>
+              <w:t>Azure SQL</w:t>
+            </w:r>
+          </w:p>
+          <w:p>
+            <w:pPr>
+              <w:rPr>
+                <w:rFonts w:ascii="Inter" w:hAnsi="Inter"/>
+                <w:sz w:val="18"/>
+                <w:szCs w:val="18"/>
+              </w:rPr>
+            </w:pPr>
+          </w:p>
+          <w:p>
+            <w:pPr>
+              <w:rPr>
+                <w:rFonts w:ascii="Inter" w:hAnsi="Inter"/>
+                <w:b/>
+                <w:bCs/>
+                <w:sz w:val="18"/>
+                <w:szCs w:val="18"/>
+              </w:rPr>
+            </w:pPr>
+            <w:r>
+              <w:rPr>
+                <w:rFonts w:ascii="Inter" w:hAnsi="Inter"/>
+                <w:b/>
+                <w:bCs/>
+                <w:sz w:val="18"/>
+                <w:szCs w:val="18"/>
+              </w:rPr>
+              <w:t>DevOps &amp; Version Control</w:t>
+            </w:r>
+          </w:p>
+          <w:p>
+            <w:pPr>
+              <w:rPr>
+                <w:rFonts w:ascii="Inter" w:hAnsi="Inter"/>
+                <w:sz w:val="18"/>
+                <w:szCs w:val="18"/>
+              </w:rPr>
+            </w:pPr>
+            <w:r>
+              <w:rPr>
+                <w:rFonts w:ascii="Inter" w:hAnsi="Inter"/>
+                <w:sz w:val="18"/>
+                <w:szCs w:val="18"/>
+              </w:rPr>
+              <w:t>Azure DevOps, GitHub, Git</w:t>
+            </w:r>
+          </w:p>
+          <w:p>
+            <w:pPr>
+              <w:rPr>
+                <w:rFonts w:ascii="Inter" w:hAnsi="Inter"/>
+                <w:b/>
+                <w:bCs/>
+                <w:sz w:val="18"/>
+                <w:szCs w:val="18"/>
+              </w:rPr>
+            </w:pPr>
+          </w:p>
+          <w:p>
+            <w:pPr>
+              <w:rPr>
+                <w:rFonts w:ascii="Inter" w:hAnsi="Inter"/>
+                <w:b/>
+                <w:bCs/>
+                <w:sz w:val="18"/>
+                <w:szCs w:val="18"/>
+              </w:rPr>
+            </w:pPr>
+            <w:r>
+              <w:rPr>
+                <w:rFonts w:ascii="Inter" w:hAnsi="Inter"/>
+                <w:b/>
+                <w:bCs/>
+                <w:sz w:val="18"/>
+                <w:szCs w:val="18"/>
+              </w:rPr>
+              <w:t>Methodology &amp; Workflow</w:t>
+            </w:r>
+          </w:p>
+          <w:p>
+            <w:pPr>
+              <w:rPr>
+                <w:rFonts w:ascii="Inter" w:hAnsi="Inter"/>
+                <w:sz w:val="18"/>
+                <w:szCs w:val="18"/>
+              </w:rPr>
+            </w:pPr>
+            <w:r>
+              <w:rPr>
+                <w:rFonts w:ascii="Inter" w:hAnsi="Inter"/>
+                <w:sz w:val="18"/>
+                <w:szCs w:val="18"/>
+              </w:rPr>
+              <w:t>Agile Methodology</w:t>
+            </w:r>
+          </w:p>
+          <w:p>
+            <w:pPr>
+              <w:rPr>
+                <w:rFonts w:ascii="Inter" w:hAnsi="Inter"/>
+                <w:sz w:val="18"/>
+                <w:szCs w:val="18"/>
+              </w:rPr>
+            </w:pPr>
+          </w:p>
+          <w:p>
+            <w:pPr>
+              <w:rPr>
+                <w:rFonts w:ascii="Inter" w:hAnsi="Inter"/>
+                <w:b/>
+                <w:bCs/>
+                <w:sz w:val="18"/>
+                <w:szCs w:val="18"/>
+              </w:rPr>
+            </w:pPr>
+            <w:r>
+              <w:rPr>
+                <w:rFonts w:ascii="Inter" w:hAnsi="Inter"/>
+                <w:b/>
+                <w:bCs/>
+                <w:sz w:val="18"/>
+                <w:szCs w:val="18"/>
+              </w:rPr>
+              <w:t>Architectural Pattern &amp; Integration</w:t>
+            </w:r>
+          </w:p>
+          <w:p>
+            <w:pPr>
+              <w:rPr>
+                <w:rFonts w:ascii="Inter" w:hAnsi="Inter"/>
+                <w:sz w:val="18"/>
+                <w:szCs w:val="18"/>
+              </w:rPr>
+            </w:pPr>
+            <w:r>
+              <w:rPr>
+                <w:rFonts w:ascii="Inter" w:hAnsi="Inter"/>
+                <w:sz w:val="18"/>
+                <w:szCs w:val="18"/>
+              </w:rPr>
+              <w:t>Module Federation, API Design and Integration</w:t>
+            </w:r>
+          </w:p>
+          <w:p>
+            <w:pPr>
               <w:rPr>
                 <w:rFonts w:ascii="Inter" w:hAnsi="Inter"/>
                 <w:b/>
@@ -801,7 +1093,117 @@
                 <w:sz w:val="20"/>
                 <w:szCs w:val="20"/>
               </w:rPr>
-              <w:t>Programming Languages &amp; Scripting</w:t>
+            </w:pPr>
+          </w:p>
+          <w:p>
+            <w:pPr>
+              <w:rPr>
+                <w:rFonts w:ascii="Inter" w:hAnsi="Inter"/>
+                <w:b/>
+                <w:bCs/>
+                <w:sz w:val="18"/>
+                <w:szCs w:val="18"/>
+              </w:rPr>
+            </w:pPr>
+            <w:r>
+              <w:rPr>
+                <w:rFonts w:ascii="Inter" w:hAnsi="Inter"/>
+                <w:b/>
+                <w:bCs/>
+                <w:sz w:val="18"/>
+                <w:szCs w:val="18"/>
+              </w:rPr>
+              <w:t>Software Skills</w:t>
+            </w:r>
+          </w:p>
+          <w:p>
+            <w:pPr>
+              <w:rPr>
+                <w:rFonts w:ascii="Inter" w:hAnsi="Inter"/>
+                <w:sz w:val="18"/>
+                <w:szCs w:val="18"/>
+              </w:rPr>
+            </w:pPr>
+            <w:r>
+              <w:rPr>
+                <w:rFonts w:ascii="Inter" w:hAnsi="Inter"/>
+                <w:sz w:val="18"/>
+                <w:szCs w:val="18"/>
+              </w:rPr>
+              <w:t>Workspace Related</w:t>
+            </w:r>
+          </w:p>
+          <w:p>
+            <w:pPr>
+              <w:rPr>
+                <w:rFonts w:ascii="Inter" w:hAnsi="Inter"/>
+                <w:i/>
+                <w:iCs/>
+                <w:sz w:val="18"/>
+                <w:szCs w:val="18"/>
+              </w:rPr>
+            </w:pPr>
+            <w:r>
+              <w:rPr>
+                <w:rFonts w:ascii="Inter" w:hAnsi="Inter"/>
+                <w:i/>
+                <w:iCs/>
+                <w:sz w:val="18"/>
+                <w:szCs w:val="18"/>
+              </w:rPr>
+              <w:t>Visual Studio,</w:t>
+            </w:r>
+            <w:r>
+              <w:rPr>
+                <w:rFonts w:ascii="Inter" w:hAnsi="Inter"/>
+                <w:i/>
+                <w:iCs/>
+                <w:sz w:val="18"/>
+                <w:szCs w:val="18"/>
+              </w:rPr>
+              <w:t xml:space="preserve"> VS Code, </w:t>
+            </w:r>
+            <w:r>
+              <w:rPr>
+                <w:rFonts w:ascii="Inter" w:hAnsi="Inter"/>
+                <w:i/>
+                <w:iCs/>
+                <w:sz w:val="18"/>
+                <w:szCs w:val="18"/>
+              </w:rPr>
+              <w:t>Azure DevOp</w:t>
+            </w:r>
+            <w:r>
+              <w:rPr>
+                <w:rFonts w:ascii="Inter" w:hAnsi="Inter"/>
+                <w:i/>
+                <w:iCs/>
+                <w:sz w:val="18"/>
+                <w:szCs w:val="18"/>
+              </w:rPr>
+              <w:t xml:space="preserve">s, Azure Portal, </w:t>
+            </w:r>
+            <w:proofErr w:type="spellStart"/>
+            <w:r>
+              <w:rPr>
+                <w:rFonts w:ascii="Inter" w:hAnsi="Inter"/>
+                <w:i/>
+                <w:iCs/>
+                <w:sz w:val="18"/>
+                <w:szCs w:val="18"/>
+              </w:rPr>
+              <w:t>DBeaver</w:t>
+            </w:r>
+            <w:proofErr w:type="spellEnd"/>
+            <w:r>
+              <w:rPr>
+                <w:rFonts w:ascii="Inter" w:hAnsi="Inter"/>
+                <w:i/>
+                <w:iCs/>
+                <w:sz w:val="18"/>
+                <w:szCs w:val="18"/>
+              </w:rPr>
+              <w:t>, GitHub</w:t>
             </w:r>
           </w:p>
           <w:p>
@@ -812,443 +1214,20 @@
                 <w:szCs w:val="20"/>
               </w:rPr>
             </w:pPr>
-            <w:r>
-              <w:rPr>
-                <w:rFonts w:ascii="Inter" w:hAnsi="Inter"/>
-                <w:sz w:val="20"/>
-                <w:szCs w:val="20"/>
-              </w:rPr>
-              <w:t>TypeScript, C#, Python, JavaScript</w:t>
-            </w:r>
-          </w:p>
-          <w:p>
-            <w:pPr>
-              <w:rPr>
-                <w:rFonts w:ascii="Inter" w:hAnsi="Inter"/>
-                <w:sz w:val="20"/>
-                <w:szCs w:val="20"/>
-              </w:rPr>
-            </w:pPr>
-          </w:p>
-          <w:p>
-            <w:pPr>
-              <w:rPr>
-                <w:rFonts w:ascii="Inter" w:hAnsi="Inter"/>
-                <w:b/>
-                <w:bCs/>
-                <w:sz w:val="20"/>
-                <w:szCs w:val="20"/>
-              </w:rPr>
-            </w:pPr>
-            <w:r>
-              <w:rPr>
-                <w:rFonts w:ascii="Inter" w:hAnsi="Inter"/>
-                <w:b/>
-                <w:bCs/>
-                <w:sz w:val="20"/>
-                <w:szCs w:val="20"/>
-              </w:rPr>
-              <w:t>Web Development &amp; Frontend</w:t>
-            </w:r>
-          </w:p>
-          <w:p>
-            <w:pPr>
-              <w:rPr>
-                <w:rFonts w:ascii="Inter" w:hAnsi="Inter"/>
-                <w:sz w:val="20"/>
-                <w:szCs w:val="20"/>
-              </w:rPr>
-            </w:pPr>
-            <w:r>
-              <w:rPr>
-                <w:rFonts w:ascii="Inter" w:hAnsi="Inter"/>
-                <w:sz w:val="20"/>
-                <w:szCs w:val="20"/>
-              </w:rPr>
-              <w:t>Angular Framework, HTML5, CSS3/SCSS</w:t>
-            </w:r>
-          </w:p>
-          <w:p>
-            <w:pPr>
-              <w:rPr>
-                <w:rFonts w:ascii="Inter" w:hAnsi="Inter"/>
-                <w:sz w:val="20"/>
-                <w:szCs w:val="20"/>
-              </w:rPr>
-            </w:pPr>
-          </w:p>
-          <w:p>
-            <w:pPr>
-              <w:rPr>
-                <w:rFonts w:ascii="Inter" w:hAnsi="Inter"/>
-                <w:b/>
-                <w:bCs/>
-                <w:sz w:val="20"/>
-                <w:szCs w:val="20"/>
-              </w:rPr>
-            </w:pPr>
-            <w:r>
-              <w:rPr>
-                <w:rFonts w:ascii="Inter" w:hAnsi="Inter"/>
-                <w:b/>
-                <w:bCs/>
-                <w:sz w:val="20"/>
-                <w:szCs w:val="20"/>
-              </w:rPr>
-              <w:t>Backend &amp; Server-Side</w:t>
-            </w:r>
-          </w:p>
-          <w:p>
-            <w:pPr>
-              <w:rPr>
-                <w:rFonts w:ascii="Inter" w:hAnsi="Inter"/>
-                <w:sz w:val="20"/>
-                <w:szCs w:val="20"/>
-              </w:rPr>
-            </w:pPr>
-            <w:r>
-              <w:rPr>
-                <w:rFonts w:ascii="Inter" w:hAnsi="Inter"/>
-                <w:sz w:val="20"/>
-                <w:szCs w:val="20"/>
-              </w:rPr>
-              <w:t>C#, .NET, Azure SQL</w:t>
-            </w:r>
-          </w:p>
-          <w:p>
-            <w:pPr>
-              <w:rPr>
-                <w:rFonts w:ascii="Inter" w:hAnsi="Inter"/>
-                <w:sz w:val="20"/>
-                <w:szCs w:val="20"/>
-              </w:rPr>
-            </w:pPr>
-          </w:p>
-          <w:p>
-            <w:pPr>
-              <w:rPr>
-                <w:rFonts w:ascii="Inter" w:hAnsi="Inter"/>
-                <w:b/>
-                <w:bCs/>
-                <w:sz w:val="20"/>
-                <w:szCs w:val="20"/>
-              </w:rPr>
-            </w:pPr>
-            <w:r>
-              <w:rPr>
-                <w:rFonts w:ascii="Inter" w:hAnsi="Inter"/>
-                <w:b/>
-                <w:bCs/>
-                <w:sz w:val="20"/>
-                <w:szCs w:val="20"/>
-              </w:rPr>
-              <w:t>Databases</w:t>
-            </w:r>
-          </w:p>
-          <w:p>
-            <w:pPr>
-              <w:rPr>
-                <w:rFonts w:ascii="Inter" w:hAnsi="Inter"/>
-                <w:sz w:val="20"/>
-                <w:szCs w:val="20"/>
-              </w:rPr>
-            </w:pPr>
-            <w:r>
-              <w:rPr>
-                <w:rFonts w:ascii="Inter" w:hAnsi="Inter"/>
-                <w:sz w:val="20"/>
-                <w:szCs w:val="20"/>
-              </w:rPr>
-              <w:t>Azure SQL</w:t>
-            </w:r>
-          </w:p>
-          <w:p>
-            <w:pPr>
-              <w:rPr>
-                <w:rFonts w:ascii="Inter" w:hAnsi="Inter"/>
-                <w:sz w:val="20"/>
-                <w:szCs w:val="20"/>
-              </w:rPr>
-            </w:pPr>
-          </w:p>
-          <w:p>
-            <w:pPr>
-              <w:rPr>
-                <w:rFonts w:ascii="Inter" w:hAnsi="Inter"/>
-                <w:b/>
-                <w:bCs/>
-                <w:sz w:val="20"/>
-                <w:szCs w:val="20"/>
-              </w:rPr>
-            </w:pPr>
-            <w:r>
-              <w:rPr>
-                <w:rFonts w:ascii="Inter" w:hAnsi="Inter"/>
-                <w:b/>
-                <w:bCs/>
-                <w:sz w:val="20"/>
-                <w:szCs w:val="20"/>
-              </w:rPr>
-              <w:t>DevOps &amp; Version Control</w:t>
-            </w:r>
-          </w:p>
-          <w:p>
-            <w:pPr>
-              <w:rPr>
-                <w:rFonts w:ascii="Inter" w:hAnsi="Inter"/>
-                <w:sz w:val="20"/>
-                <w:szCs w:val="20"/>
-              </w:rPr>
-            </w:pPr>
-            <w:r>
-              <w:rPr>
-                <w:rFonts w:ascii="Inter" w:hAnsi="Inter"/>
-                <w:sz w:val="20"/>
-                <w:szCs w:val="20"/>
-              </w:rPr>
-              <w:t>Azure DevOps, GitHub, Git</w:t>
-            </w:r>
-          </w:p>
-          <w:p>
-            <w:pPr>
-              <w:rPr>
-                <w:rFonts w:ascii="Inter" w:hAnsi="Inter"/>
-                <w:b/>
-                <w:bCs/>
-                <w:sz w:val="20"/>
-                <w:szCs w:val="20"/>
-              </w:rPr>
-            </w:pPr>
-          </w:p>
-          <w:p>
-            <w:pPr>
-              <w:rPr>
-                <w:rFonts w:ascii="Inter" w:hAnsi="Inter"/>
-                <w:b/>
-                <w:bCs/>
-                <w:sz w:val="20"/>
-                <w:szCs w:val="20"/>
-              </w:rPr>
-            </w:pPr>
-            <w:r>
-              <w:rPr>
-                <w:rFonts w:ascii="Inter" w:hAnsi="Inter"/>
-                <w:b/>
-                <w:bCs/>
-                <w:sz w:val="20"/>
-                <w:szCs w:val="20"/>
-              </w:rPr>
-              <w:t>Methodology &amp; Workflow</w:t>
-            </w:r>
-          </w:p>
-          <w:p>
-            <w:pPr>
-              <w:rPr>
-                <w:rFonts w:ascii="Inter" w:hAnsi="Inter"/>
-                <w:sz w:val="20"/>
-                <w:szCs w:val="20"/>
-              </w:rPr>
-            </w:pPr>
-            <w:r>
-              <w:rPr>
-                <w:rFonts w:ascii="Inter" w:hAnsi="Inter"/>
-                <w:sz w:val="20"/>
-                <w:szCs w:val="20"/>
-              </w:rPr>
-              <w:t>Agile Methodology</w:t>
-            </w:r>
-          </w:p>
-          <w:p>
-            <w:pPr>
-              <w:rPr>
-                <w:rFonts w:ascii="Inter" w:hAnsi="Inter"/>
-                <w:sz w:val="20"/>
-                <w:szCs w:val="20"/>
-              </w:rPr>
-            </w:pPr>
-          </w:p>
-          <w:p>
-            <w:pPr>
-              <w:rPr>
-                <w:rFonts w:ascii="Inter" w:hAnsi="Inter"/>
-                <w:b/>
-                <w:bCs/>
-                <w:sz w:val="20"/>
-                <w:szCs w:val="20"/>
-              </w:rPr>
-            </w:pPr>
-            <w:r>
-              <w:rPr>
-                <w:rFonts w:ascii="Inter" w:hAnsi="Inter"/>
-                <w:b/>
-                <w:bCs/>
-                <w:sz w:val="20"/>
-                <w:szCs w:val="20"/>
-              </w:rPr>
-              <w:t>Architectural Pattern &amp; Integration</w:t>
-            </w:r>
-          </w:p>
-          <w:p>
-            <w:pPr>
-              <w:rPr>
-                <w:rFonts w:ascii="Inter" w:hAnsi="Inter"/>
-                <w:sz w:val="20"/>
-                <w:szCs w:val="20"/>
-              </w:rPr>
-            </w:pPr>
-            <w:r>
-              <w:rPr>
-                <w:rFonts w:ascii="Inter" w:hAnsi="Inter"/>
-                <w:sz w:val="20"/>
-                <w:szCs w:val="20"/>
-              </w:rPr>
-              <w:t>Module Federation, API Design and Integration</w:t>
-            </w:r>
-          </w:p>
-          <w:p>
-            <w:pPr>
-              <w:rPr>
-                <w:rFonts w:ascii="Inter" w:hAnsi="Inter"/>
-                <w:b/>
-                <w:bCs/>
-                <w:sz w:val="20"/>
-                <w:szCs w:val="20"/>
-              </w:rPr>
-            </w:pPr>
-          </w:p>
-          <w:p>
-            <w:pPr>
-              <w:rPr>
-                <w:rFonts w:ascii="Inter" w:hAnsi="Inter"/>
-                <w:b/>
-                <w:bCs/>
-                <w:sz w:val="20"/>
-                <w:szCs w:val="20"/>
-              </w:rPr>
-            </w:pPr>
-            <w:r>
-              <w:rPr>
-                <w:rFonts w:ascii="Inter" w:hAnsi="Inter"/>
-                <w:b/>
-                <w:bCs/>
-                <w:sz w:val="20"/>
-                <w:szCs w:val="20"/>
-              </w:rPr>
-              <w:t>Software Skills</w:t>
-            </w:r>
-          </w:p>
-          <w:p>
-            <w:pPr>
-              <w:rPr>
-                <w:rFonts w:ascii="Inter" w:hAnsi="Inter"/>
-                <w:sz w:val="20"/>
-                <w:szCs w:val="20"/>
-              </w:rPr>
-            </w:pPr>
-            <w:r>
-              <w:rPr>
-                <w:rFonts w:ascii="Inter" w:hAnsi="Inter"/>
-                <w:sz w:val="20"/>
-                <w:szCs w:val="20"/>
-              </w:rPr>
-              <w:t>Workspace Related</w:t>
-            </w:r>
-          </w:p>
-          <w:p>
-            <w:pPr>
-              <w:rPr>
-                <w:rFonts w:ascii="Inter" w:hAnsi="Inter"/>
-                <w:i/>
-                <w:iCs/>
-                <w:sz w:val="18"/>
-                <w:szCs w:val="18"/>
-              </w:rPr>
-            </w:pPr>
-            <w:r>
-              <w:rPr>
-                <w:rFonts w:ascii="Inter" w:hAnsi="Inter"/>
-                <w:i/>
-                <w:iCs/>
-                <w:sz w:val="18"/>
-                <w:szCs w:val="18"/>
-              </w:rPr>
-              <w:t>Visual Studio,</w:t>
-            </w:r>
-            <w:r>
-              <w:rPr>
-                <w:rFonts w:ascii="Inter" w:hAnsi="Inter"/>
-                <w:i/>
-                <w:iCs/>
-                <w:sz w:val="18"/>
-                <w:szCs w:val="18"/>
-              </w:rPr>
-              <w:t xml:space="preserve"> VS Code, </w:t>
-            </w:r>
-            <w:r>
-              <w:rPr>
-                <w:rFonts w:ascii="Inter" w:hAnsi="Inter"/>
-                <w:i/>
-                <w:iCs/>
-                <w:sz w:val="18"/>
-                <w:szCs w:val="18"/>
-              </w:rPr>
-              <w:t>Azure DevOp</w:t>
-            </w:r>
-            <w:r>
-              <w:rPr>
-                <w:rFonts w:ascii="Inter" w:hAnsi="Inter"/>
-                <w:i/>
-                <w:iCs/>
-                <w:sz w:val="18"/>
-                <w:szCs w:val="18"/>
-              </w:rPr>
-              <w:t xml:space="preserve">s, Azure Portal, </w:t>
-            </w:r>
-            <w:proofErr w:type="spellStart"/>
-            <w:r>
-              <w:rPr>
-                <w:rFonts w:ascii="Inter" w:hAnsi="Inter"/>
-                <w:i/>
-                <w:iCs/>
-                <w:sz w:val="18"/>
-                <w:szCs w:val="18"/>
-              </w:rPr>
-              <w:t>DBeaver</w:t>
-            </w:r>
-            <w:proofErr w:type="spellEnd"/>
-            <w:r>
-              <w:rPr>
-                <w:rFonts w:ascii="Inter" w:hAnsi="Inter"/>
-                <w:i/>
-                <w:iCs/>
-                <w:sz w:val="18"/>
-                <w:szCs w:val="18"/>
-              </w:rPr>
-              <w:t>, GitHub</w:t>
-            </w:r>
-          </w:p>
-          <w:p>
-            <w:pPr>
-              <w:rPr>
-                <w:rFonts w:ascii="Inter" w:hAnsi="Inter"/>
-                <w:sz w:val="20"/>
-                <w:szCs w:val="20"/>
-              </w:rPr>
-            </w:pPr>
-          </w:p>
-          <w:p>
-            <w:pPr>
-              <w:rPr>
-                <w:rFonts w:ascii="Inter" w:hAnsi="Inter"/>
-                <w:sz w:val="20"/>
-                <w:szCs w:val="20"/>
-              </w:rPr>
-            </w:pPr>
-            <w:r>
-              <w:rPr>
-                <w:rFonts w:ascii="Inter" w:hAnsi="Inter"/>
-                <w:sz w:val="20"/>
-                <w:szCs w:val="20"/>
+          </w:p>
+          <w:p>
+            <w:pPr>
+              <w:rPr>
+                <w:rFonts w:ascii="Inter" w:hAnsi="Inter"/>
+                <w:sz w:val="18"/>
+                <w:szCs w:val="18"/>
+              </w:rPr>
+            </w:pPr>
+            <w:r>
+              <w:rPr>
+                <w:rFonts w:ascii="Inter" w:hAnsi="Inter"/>
+                <w:sz w:val="18"/>
+                <w:szCs w:val="18"/>
               </w:rPr>
               <w:t>Office Applications</w:t>
             </w:r>
@@ -1663,72 +1642,72 @@
             <w:pPr>
               <w:rPr>
                 <w:rFonts w:ascii="Inter" w:hAnsi="Inter"/>
-                <w:sz w:val="20"/>
-                <w:szCs w:val="20"/>
-              </w:rPr>
-            </w:pPr>
-          </w:p>
-          <w:p>
-            <w:pPr>
-              <w:rPr>
-                <w:rFonts w:ascii="Inter" w:hAnsi="Inter"/>
-                <w:sz w:val="20"/>
-                <w:szCs w:val="20"/>
-              </w:rPr>
-            </w:pPr>
-            <w:r>
-              <w:rPr>
-                <w:rFonts w:ascii="Inter" w:hAnsi="Inter"/>
-                <w:sz w:val="20"/>
-                <w:szCs w:val="20"/>
+                <w:sz w:val="18"/>
+                <w:szCs w:val="18"/>
+              </w:rPr>
+            </w:pPr>
+          </w:p>
+          <w:p>
+            <w:pPr>
+              <w:rPr>
+                <w:rFonts w:ascii="Inter" w:hAnsi="Inter"/>
+                <w:sz w:val="18"/>
+                <w:szCs w:val="18"/>
+              </w:rPr>
+            </w:pPr>
+            <w:r>
+              <w:rPr>
+                <w:rFonts w:ascii="Inter" w:hAnsi="Inter"/>
+                <w:sz w:val="18"/>
+                <w:szCs w:val="18"/>
               </w:rPr>
               <w:t>Currently working</w:t>
             </w:r>
             <w:r>
               <w:rPr>
                 <w:rFonts w:ascii="Inter" w:hAnsi="Inter"/>
-                <w:sz w:val="20"/>
-                <w:szCs w:val="20"/>
+                <w:sz w:val="18"/>
+                <w:szCs w:val="18"/>
               </w:rPr>
               <w:t xml:space="preserve"> with </w:t>
             </w:r>
             <w:r>
               <w:rPr>
                 <w:rFonts w:ascii="Inter" w:hAnsi="Inter"/>
-                <w:sz w:val="20"/>
-                <w:szCs w:val="20"/>
+                <w:sz w:val="18"/>
+                <w:szCs w:val="18"/>
               </w:rPr>
               <w:t>4</w:t>
             </w:r>
             <w:r>
               <w:rPr>
                 <w:rFonts w:ascii="Inter" w:hAnsi="Inter"/>
-                <w:sz w:val="20"/>
-                <w:szCs w:val="20"/>
+                <w:sz w:val="18"/>
+                <w:szCs w:val="18"/>
               </w:rPr>
               <w:t xml:space="preserve"> years of experience</w:t>
             </w:r>
             <w:r>
               <w:rPr>
                 <w:rFonts w:ascii="Inter" w:hAnsi="Inter"/>
-                <w:sz w:val="20"/>
-                <w:szCs w:val="20"/>
+                <w:sz w:val="18"/>
+                <w:szCs w:val="18"/>
               </w:rPr>
               <w:t xml:space="preserve"> as a </w:t>
             </w:r>
             <w:r>
               <w:rPr>
                 <w:rFonts w:ascii="Inter" w:hAnsi="Inter"/>
-                <w:sz w:val="20"/>
-                <w:szCs w:val="20"/>
+                <w:sz w:val="18"/>
+                <w:szCs w:val="18"/>
               </w:rPr>
               <w:t>Full Stack Developer building scalable web application using Angular (Typescript), C#, and Azure SQL. I have contributed to both frontend and backend development</w:t>
             </w:r>
             <w:r>
               <w:rPr>
                 <w:rFonts w:ascii="Inter" w:hAnsi="Inter"/>
-                <w:sz w:val="20"/>
-                <w:szCs w:val="20"/>
+                <w:sz w:val="18"/>
+                <w:szCs w:val="18"/>
               </w:rPr>
               <w:t>.</w:t>
             </w:r>
@@ -1737,8 +1716,8 @@
             <w:pPr>
               <w:rPr>
                 <w:rFonts w:ascii="Inter" w:hAnsi="Inter"/>
-                <w:sz w:val="20"/>
-                <w:szCs w:val="20"/>
+                <w:sz w:val="18"/>
+                <w:szCs w:val="18"/>
               </w:rPr>
             </w:pPr>
           </w:p>
@@ -1883,8 +1862,8 @@
                 <w:rFonts w:ascii="Inter" w:hAnsi="Inter"/>
                 <w:b/>
                 <w:bCs/>
-                <w:sz w:val="20"/>
-                <w:szCs w:val="20"/>
+                <w:sz w:val="18"/>
+                <w:szCs w:val="18"/>
               </w:rPr>
             </w:pPr>
           </w:p>
@@ -1894,8 +1873,8 @@
                 <w:rFonts w:ascii="Inter" w:hAnsi="Inter"/>
                 <w:b/>
                 <w:bCs/>
-                <w:sz w:val="20"/>
-                <w:szCs w:val="20"/>
+                <w:sz w:val="18"/>
+                <w:szCs w:val="18"/>
               </w:rPr>
             </w:pPr>
             <w:r>
@@ -1903,8 +1882,8 @@
                 <w:rFonts w:ascii="Inter" w:hAnsi="Inter"/>
                 <w:b/>
                 <w:bCs/>
-                <w:sz w:val="20"/>
-                <w:szCs w:val="20"/>
+                <w:sz w:val="18"/>
+                <w:szCs w:val="18"/>
               </w:rPr>
               <w:t>Project Lead / Full Stack Developer</w:t>
             </w:r>
@@ -1913,15 +1892,15 @@
             <w:pPr>
               <w:rPr>
                 <w:rFonts w:ascii="Inter" w:hAnsi="Inter"/>
-                <w:sz w:val="20"/>
-                <w:szCs w:val="20"/>
-              </w:rPr>
-            </w:pPr>
-            <w:r>
-              <w:rPr>
-                <w:rFonts w:ascii="Inter" w:hAnsi="Inter"/>
-                <w:sz w:val="20"/>
-                <w:szCs w:val="20"/>
+                <w:sz w:val="18"/>
+                <w:szCs w:val="18"/>
+              </w:rPr>
+            </w:pPr>
+            <w:r>
+              <w:rPr>
+                <w:rFonts w:ascii="Inter" w:hAnsi="Inter"/>
+                <w:sz w:val="18"/>
+                <w:szCs w:val="18"/>
               </w:rPr>
               <w:t>CCG Systems – Performance Management System Web App</w:t>
             </w:r>
@@ -1932,8 +1911,8 @@
                 <w:rFonts w:ascii="Inter" w:hAnsi="Inter"/>
                 <w:i/>
                 <w:iCs/>
-                <w:sz w:val="20"/>
-                <w:szCs w:val="20"/>
+                <w:sz w:val="18"/>
+                <w:szCs w:val="18"/>
               </w:rPr>
             </w:pPr>
             <w:r>
@@ -1941,8 +1920,8 @@
                 <w:rFonts w:ascii="Inter" w:hAnsi="Inter"/>
                 <w:i/>
                 <w:iCs/>
-                <w:sz w:val="20"/>
-                <w:szCs w:val="20"/>
+                <w:sz w:val="18"/>
+                <w:szCs w:val="18"/>
               </w:rPr>
               <w:t>April 2022</w:t>
             </w:r>
@@ -1951,8 +1930,8 @@
                 <w:rFonts w:ascii="Inter" w:hAnsi="Inter"/>
                 <w:i/>
                 <w:iCs/>
-                <w:sz w:val="20"/>
-                <w:szCs w:val="20"/>
+                <w:sz w:val="18"/>
+                <w:szCs w:val="18"/>
               </w:rPr>
               <w:t xml:space="preserve"> – Present</w:t>
             </w:r>
@@ -1966,15 +1945,15 @@
               </w:numPr>
               <w:rPr>
                 <w:rFonts w:ascii="Inter" w:hAnsi="Inter"/>
-                <w:sz w:val="20"/>
-                <w:szCs w:val="20"/>
-              </w:rPr>
-            </w:pPr>
-            <w:r>
-              <w:rPr>
-                <w:rFonts w:ascii="Inter" w:hAnsi="Inter"/>
-                <w:sz w:val="20"/>
-                <w:szCs w:val="20"/>
+                <w:sz w:val="18"/>
+                <w:szCs w:val="18"/>
+              </w:rPr>
+            </w:pPr>
+            <w:r>
+              <w:rPr>
+                <w:rFonts w:ascii="Inter" w:hAnsi="Inter"/>
+                <w:sz w:val="18"/>
+                <w:szCs w:val="18"/>
               </w:rPr>
               <w:t xml:space="preserve">Contributed and led the development of performance management systems that will be used for municipalities within </w:t>
             </w:r>
@@ -1983,16 +1962,16 @@
                 <w:rFonts w:ascii="Inter" w:hAnsi="Inter"/>
                 <w:b/>
                 <w:bCs/>
-                <w:sz w:val="20"/>
-                <w:szCs w:val="20"/>
+                <w:sz w:val="18"/>
+                <w:szCs w:val="18"/>
               </w:rPr>
               <w:t>South Africa</w:t>
             </w:r>
             <w:r>
               <w:rPr>
                 <w:rFonts w:ascii="Inter" w:hAnsi="Inter"/>
-                <w:sz w:val="20"/>
-                <w:szCs w:val="20"/>
+                <w:sz w:val="18"/>
+                <w:szCs w:val="18"/>
               </w:rPr>
               <w:t>.</w:t>
             </w:r>
@@ -2006,39 +1985,39 @@
               </w:numPr>
               <w:rPr>
                 <w:rFonts w:ascii="Inter" w:hAnsi="Inter"/>
-                <w:sz w:val="20"/>
-                <w:szCs w:val="20"/>
-              </w:rPr>
-            </w:pPr>
-            <w:r>
-              <w:rPr>
-                <w:rFonts w:ascii="Inter" w:hAnsi="Inter"/>
-                <w:sz w:val="20"/>
-                <w:szCs w:val="20"/>
+                <w:sz w:val="18"/>
+                <w:szCs w:val="18"/>
+              </w:rPr>
+            </w:pPr>
+            <w:r>
+              <w:rPr>
+                <w:rFonts w:ascii="Inter" w:hAnsi="Inter"/>
+                <w:sz w:val="18"/>
+                <w:szCs w:val="18"/>
               </w:rPr>
               <w:t xml:space="preserve">Contributed </w:t>
             </w:r>
             <w:r>
               <w:rPr>
                 <w:rFonts w:ascii="Inter" w:hAnsi="Inter"/>
-                <w:sz w:val="20"/>
-                <w:szCs w:val="20"/>
+                <w:sz w:val="18"/>
+                <w:szCs w:val="18"/>
               </w:rPr>
               <w:t>to</w:t>
             </w:r>
             <w:r>
               <w:rPr>
                 <w:rFonts w:ascii="Inter" w:hAnsi="Inter"/>
-                <w:sz w:val="20"/>
-                <w:szCs w:val="20"/>
+                <w:sz w:val="18"/>
+                <w:szCs w:val="18"/>
               </w:rPr>
               <w:t xml:space="preserve"> the integration of module federation in an Angular-based project to enhance scalability and flexibility in developing </w:t>
             </w:r>
             <w:r>
               <w:rPr>
                 <w:rFonts w:ascii="Inter" w:hAnsi="Inter"/>
-                <w:sz w:val="20"/>
-                <w:szCs w:val="20"/>
+                <w:sz w:val="18"/>
+                <w:szCs w:val="18"/>
               </w:rPr>
               <w:t>multiple modules within the system.</w:t>
             </w:r>
@@ -2052,15 +2031,15 @@
               </w:numPr>
               <w:rPr>
                 <w:rFonts w:ascii="Inter" w:hAnsi="Inter"/>
-                <w:sz w:val="20"/>
-                <w:szCs w:val="20"/>
-              </w:rPr>
-            </w:pPr>
-            <w:r>
-              <w:rPr>
-                <w:rFonts w:ascii="Inter" w:hAnsi="Inter"/>
-                <w:sz w:val="20"/>
-                <w:szCs w:val="20"/>
+                <w:sz w:val="18"/>
+                <w:szCs w:val="18"/>
+              </w:rPr>
+            </w:pPr>
+            <w:r>
+              <w:rPr>
+                <w:rFonts w:ascii="Inter" w:hAnsi="Inter"/>
+                <w:sz w:val="18"/>
+                <w:szCs w:val="18"/>
               </w:rPr>
               <w:t>Contributed at building user interfaces, implementing backend logic, and managing relational databases.</w:t>
             </w:r>
@@ -2074,15 +2053,15 @@
               </w:numPr>
               <w:rPr>
                 <w:rFonts w:ascii="Inter" w:hAnsi="Inter"/>
-                <w:sz w:val="20"/>
-                <w:szCs w:val="20"/>
-              </w:rPr>
-            </w:pPr>
-            <w:r>
-              <w:rPr>
-                <w:rFonts w:ascii="Inter" w:hAnsi="Inter"/>
-                <w:sz w:val="20"/>
-                <w:szCs w:val="20"/>
+                <w:sz w:val="18"/>
+                <w:szCs w:val="18"/>
+              </w:rPr>
+            </w:pPr>
+            <w:r>
+              <w:rPr>
+                <w:rFonts w:ascii="Inter" w:hAnsi="Inter"/>
+                <w:sz w:val="18"/>
+                <w:szCs w:val="18"/>
               </w:rPr>
               <w:t xml:space="preserve">Experienced integrating </w:t>
             </w:r>
@@ -2091,16 +2070,16 @@
                 <w:rFonts w:ascii="Inter" w:hAnsi="Inter"/>
                 <w:b/>
                 <w:bCs/>
-                <w:sz w:val="20"/>
-                <w:szCs w:val="20"/>
+                <w:sz w:val="18"/>
+                <w:szCs w:val="18"/>
               </w:rPr>
               <w:t>Azure DevOps</w:t>
             </w:r>
             <w:r>
               <w:rPr>
                 <w:rFonts w:ascii="Inter" w:hAnsi="Inter"/>
-                <w:sz w:val="20"/>
-                <w:szCs w:val="20"/>
+                <w:sz w:val="18"/>
+                <w:szCs w:val="18"/>
               </w:rPr>
               <w:t xml:space="preserve"> for version control, managing </w:t>
             </w:r>
@@ -2109,16 +2088,16 @@
                 <w:rFonts w:ascii="Inter" w:hAnsi="Inter"/>
                 <w:b/>
                 <w:bCs/>
-                <w:sz w:val="20"/>
-                <w:szCs w:val="20"/>
+                <w:sz w:val="18"/>
+                <w:szCs w:val="18"/>
               </w:rPr>
               <w:t>CI/CD pipelines for automation</w:t>
             </w:r>
             <w:r>
               <w:rPr>
                 <w:rFonts w:ascii="Inter" w:hAnsi="Inter"/>
-                <w:sz w:val="20"/>
-                <w:szCs w:val="20"/>
+                <w:sz w:val="18"/>
+                <w:szCs w:val="18"/>
               </w:rPr>
               <w:t xml:space="preserve">, and </w:t>
             </w:r>
@@ -2127,16 +2106,16 @@
                 <w:rFonts w:ascii="Inter" w:hAnsi="Inter"/>
                 <w:b/>
                 <w:bCs/>
-                <w:sz w:val="20"/>
-                <w:szCs w:val="20"/>
+                <w:sz w:val="18"/>
+                <w:szCs w:val="18"/>
               </w:rPr>
               <w:t>streamlining code deployment processes</w:t>
             </w:r>
             <w:r>
               <w:rPr>
                 <w:rFonts w:ascii="Inter" w:hAnsi="Inter"/>
-                <w:sz w:val="20"/>
-                <w:szCs w:val="20"/>
+                <w:sz w:val="18"/>
+                <w:szCs w:val="18"/>
               </w:rPr>
               <w:t xml:space="preserve">, and </w:t>
             </w:r>
@@ -2145,16 +2124,16 @@
                 <w:rFonts w:ascii="Inter" w:hAnsi="Inter"/>
                 <w:b/>
                 <w:bCs/>
-                <w:sz w:val="20"/>
-                <w:szCs w:val="20"/>
+                <w:sz w:val="18"/>
+                <w:szCs w:val="18"/>
               </w:rPr>
               <w:t>deploying cloud resources</w:t>
             </w:r>
             <w:r>
               <w:rPr>
                 <w:rFonts w:ascii="Inter" w:hAnsi="Inter"/>
-                <w:sz w:val="20"/>
-                <w:szCs w:val="20"/>
+                <w:sz w:val="18"/>
+                <w:szCs w:val="18"/>
               </w:rPr>
               <w:t xml:space="preserve"> such as function apps through the Azure Portal.</w:t>
             </w:r>
@@ -2168,15 +2147,15 @@
               </w:numPr>
               <w:rPr>
                 <w:rFonts w:ascii="Inter" w:hAnsi="Inter"/>
-                <w:sz w:val="20"/>
-                <w:szCs w:val="20"/>
-              </w:rPr>
-            </w:pPr>
-            <w:r>
-              <w:rPr>
-                <w:rFonts w:ascii="Inter" w:hAnsi="Inter"/>
-                <w:sz w:val="20"/>
-                <w:szCs w:val="20"/>
+                <w:sz w:val="18"/>
+                <w:szCs w:val="18"/>
+              </w:rPr>
+            </w:pPr>
+            <w:r>
+              <w:rPr>
+                <w:rFonts w:ascii="Inter" w:hAnsi="Inter"/>
+                <w:sz w:val="18"/>
+                <w:szCs w:val="18"/>
               </w:rPr>
               <w:t>Effectively collaborated within</w:t>
             </w:r>
@@ -2185,8 +2164,8 @@
                 <w:rFonts w:ascii="Inter" w:hAnsi="Inter"/>
                 <w:b/>
                 <w:bCs/>
-                <w:sz w:val="20"/>
-                <w:szCs w:val="20"/>
+                <w:sz w:val="18"/>
+                <w:szCs w:val="18"/>
               </w:rPr>
               <w:t xml:space="preserve"> Agile teams.</w:t>
             </w:r>
@@ -2195,8 +2174,8 @@
             <w:pPr>
               <w:rPr>
                 <w:rFonts w:ascii="Inter" w:hAnsi="Inter"/>
-                <w:sz w:val="20"/>
-                <w:szCs w:val="20"/>
+                <w:sz w:val="18"/>
+                <w:szCs w:val="18"/>
               </w:rPr>
             </w:pPr>
           </w:p>
@@ -2205,15 +2184,15 @@
               <w:ind w:left="360"/>
               <w:rPr>
                 <w:rFonts w:ascii="Inter" w:hAnsi="Inter"/>
-                <w:sz w:val="20"/>
-                <w:szCs w:val="20"/>
-              </w:rPr>
-            </w:pPr>
-            <w:r>
-              <w:rPr>
-                <w:rFonts w:ascii="Inter" w:hAnsi="Inter"/>
-                <w:sz w:val="20"/>
-                <w:szCs w:val="20"/>
+                <w:sz w:val="18"/>
+                <w:szCs w:val="18"/>
+              </w:rPr>
+            </w:pPr>
+            <w:r>
+              <w:rPr>
+                <w:rFonts w:ascii="Inter" w:hAnsi="Inter"/>
+                <w:sz w:val="18"/>
+                <w:szCs w:val="18"/>
               </w:rPr>
               <w:t>Contributed and implemented the following performance management system related modules:</w:t>
             </w:r>
@@ -2223,8 +2202,8 @@
               <w:ind w:left="360"/>
               <w:rPr>
                 <w:rFonts w:ascii="Inter" w:hAnsi="Inter"/>
-                <w:sz w:val="20"/>
-                <w:szCs w:val="20"/>
+                <w:sz w:val="18"/>
+                <w:szCs w:val="18"/>
               </w:rPr>
             </w:pPr>
           </w:p>
@@ -2237,8 +2216,8 @@
               </w:numPr>
               <w:rPr>
                 <w:rFonts w:ascii="Inter" w:hAnsi="Inter"/>
-                <w:sz w:val="20"/>
-                <w:szCs w:val="20"/>
+                <w:sz w:val="18"/>
+                <w:szCs w:val="18"/>
               </w:rPr>
             </w:pPr>
             <w:r>
@@ -2246,18 +2225,206 @@
                 <w:rFonts w:ascii="Inter" w:hAnsi="Inter"/>
                 <w:b/>
                 <w:bCs/>
-                <w:sz w:val="20"/>
-                <w:szCs w:val="20"/>
+                <w:sz w:val="18"/>
+                <w:szCs w:val="18"/>
               </w:rPr>
               <w:t>Host Module</w:t>
             </w:r>
             <w:r>
               <w:rPr>
                 <w:rFonts w:ascii="Inter" w:hAnsi="Inter"/>
-                <w:sz w:val="20"/>
-                <w:szCs w:val="20"/>
-              </w:rPr>
-              <w:t xml:space="preserve"> – contains all the PMS modules and related</w:t>
+                <w:sz w:val="18"/>
+                <w:szCs w:val="18"/>
+              </w:rPr>
+              <w:t xml:space="preserve"> – </w:t>
+            </w:r>
+            <w:r>
+              <w:rPr>
+                <w:rFonts w:ascii="Inter" w:hAnsi="Inter"/>
+                <w:sz w:val="18"/>
+                <w:szCs w:val="18"/>
+              </w:rPr>
+              <w:t>an Angular-based shell application using Module Federation to host and integrate multiple standalone modules (IPMS, IPMS Admin, OPMS, Workflow, RMS) under one platform with a centralized authentication, tenant configuration, and consistent navigation across modules.</w:t>
+            </w:r>
+          </w:p>
+          <w:p>
+            <w:pPr>
+              <w:pStyle w:val="ListParagraph"/>
+              <w:numPr>
+                <w:ilvl w:val="1"/>
+                <w:numId w:val="3"/>
+              </w:numPr>
+              <w:rPr>
+                <w:rFonts w:ascii="Inter" w:hAnsi="Inter"/>
+                <w:sz w:val="18"/>
+                <w:szCs w:val="18"/>
+              </w:rPr>
+            </w:pPr>
+            <w:r>
+              <w:rPr>
+                <w:rFonts w:ascii="Inter" w:hAnsi="Inter"/>
+                <w:b/>
+                <w:bCs/>
+                <w:i/>
+                <w:iCs/>
+                <w:sz w:val="18"/>
+                <w:szCs w:val="18"/>
+              </w:rPr>
+              <w:t>Feature Management</w:t>
+            </w:r>
+            <w:r>
+              <w:rPr>
+                <w:rFonts w:ascii="Inter" w:hAnsi="Inter"/>
+                <w:sz w:val="18"/>
+                <w:szCs w:val="18"/>
+              </w:rPr>
+              <w:br/>
+            </w:r>
+            <w:r>
+              <w:rPr>
+                <w:rFonts w:ascii="Inter" w:hAnsi="Inter"/>
+                <w:sz w:val="18"/>
+                <w:szCs w:val="18"/>
+              </w:rPr>
+              <w:t>Developed a feature management page enabling administrators of each tenant to toggle and configure application features, supporting a scalable multi-tenant architecture.</w:t>
+            </w:r>
+          </w:p>
+          <w:p>
+            <w:pPr>
+              <w:pStyle w:val="ListParagraph"/>
+              <w:numPr>
+                <w:ilvl w:val="1"/>
+                <w:numId w:val="3"/>
+              </w:numPr>
+              <w:rPr>
+                <w:rFonts w:ascii="Inter" w:hAnsi="Inter"/>
+                <w:sz w:val="18"/>
+                <w:szCs w:val="18"/>
+              </w:rPr>
+            </w:pPr>
+            <w:r>
+              <w:rPr>
+                <w:rFonts w:ascii="Inter" w:hAnsi="Inter"/>
+                <w:b/>
+                <w:bCs/>
+                <w:i/>
+                <w:iCs/>
+                <w:sz w:val="18"/>
+                <w:szCs w:val="18"/>
+              </w:rPr>
+              <w:t>Areas Management</w:t>
+            </w:r>
+            <w:r>
+              <w:rPr>
+                <w:rFonts w:ascii="Inter" w:hAnsi="Inter"/>
+                <w:b/>
+                <w:bCs/>
+                <w:i/>
+                <w:iCs/>
+                <w:sz w:val="18"/>
+                <w:szCs w:val="18"/>
+              </w:rPr>
+              <w:br/>
+            </w:r>
+            <w:r>
+              <w:rPr>
+                <w:rFonts w:ascii="Inter" w:hAnsi="Inter"/>
+                <w:sz w:val="18"/>
+                <w:szCs w:val="18"/>
+              </w:rPr>
+              <w:t>Built the Areas administration page, allowing configuration and management of organizational areas within the platform.</w:t>
+            </w:r>
+          </w:p>
+          <w:p>
+            <w:pPr>
+              <w:pStyle w:val="ListParagraph"/>
+              <w:numPr>
+                <w:ilvl w:val="1"/>
+                <w:numId w:val="3"/>
+              </w:numPr>
+              <w:rPr>
+                <w:rFonts w:ascii="Inter" w:hAnsi="Inter"/>
+                <w:sz w:val="18"/>
+                <w:szCs w:val="18"/>
+              </w:rPr>
+            </w:pPr>
+            <w:r>
+              <w:rPr>
+                <w:rFonts w:ascii="Inter" w:hAnsi="Inter"/>
+                <w:b/>
+                <w:bCs/>
+                <w:i/>
+                <w:iCs/>
+                <w:sz w:val="18"/>
+                <w:szCs w:val="18"/>
+              </w:rPr>
+              <w:t>Tenant Menu &amp; Database Configuration</w:t>
+            </w:r>
+            <w:r>
+              <w:rPr>
+                <w:rFonts w:ascii="Inter" w:hAnsi="Inter"/>
+                <w:sz w:val="18"/>
+                <w:szCs w:val="18"/>
+              </w:rPr>
+              <w:br/>
+            </w:r>
+            <w:r>
+              <w:rPr>
+                <w:rFonts w:ascii="Inter" w:hAnsi="Inter"/>
+                <w:sz w:val="18"/>
+                <w:szCs w:val="18"/>
+              </w:rPr>
+              <w:t>Managed per-tenant navigation configuration by provisioning and maintaining menu items through the database, and ensuring correct module visibility across client environments.</w:t>
+            </w:r>
+          </w:p>
+          <w:p>
+            <w:pPr>
+              <w:pStyle w:val="ListParagraph"/>
+              <w:numPr>
+                <w:ilvl w:val="1"/>
+                <w:numId w:val="3"/>
+              </w:numPr>
+              <w:rPr>
+                <w:rFonts w:ascii="Inter" w:hAnsi="Inter"/>
+                <w:sz w:val="18"/>
+                <w:szCs w:val="18"/>
+              </w:rPr>
+            </w:pPr>
+            <w:r>
+              <w:rPr>
+                <w:rFonts w:ascii="Inter" w:hAnsi="Inter"/>
+                <w:b/>
+                <w:bCs/>
+                <w:i/>
+                <w:iCs/>
+                <w:sz w:val="18"/>
+                <w:szCs w:val="18"/>
+              </w:rPr>
+              <w:t>Cross-Module Styling &amp; UI Fixes</w:t>
+            </w:r>
+            <w:r>
+              <w:rPr>
+                <w:rFonts w:ascii="Inter" w:hAnsi="Inter"/>
+                <w:sz w:val="18"/>
+                <w:szCs w:val="18"/>
+              </w:rPr>
+              <w:br/>
+            </w:r>
+            <w:r>
+              <w:rPr>
+                <w:rFonts w:ascii="Inter" w:hAnsi="Inter"/>
+                <w:sz w:val="18"/>
+                <w:szCs w:val="18"/>
+              </w:rPr>
+              <w:t>Resolved layout and styling consistencies across multiple feature modules integrated into the host application.</w:t>
+            </w:r>
+            <w:r>
+              <w:rPr>
+                <w:rFonts w:ascii="Inter" w:hAnsi="Inter"/>
+                <w:sz w:val="18"/>
+                <w:szCs w:val="18"/>
+              </w:rPr>
+              <w:br/>
             </w:r>
           </w:p>
           <w:p>
@@ -2269,8 +2436,8 @@
               </w:numPr>
               <w:rPr>
                 <w:rFonts w:ascii="Inter" w:hAnsi="Inter"/>
-                <w:sz w:val="20"/>
-                <w:szCs w:val="20"/>
+                <w:sz w:val="18"/>
+                <w:szCs w:val="18"/>
               </w:rPr>
             </w:pPr>
             <w:r>
@@ -2278,24 +2445,24 @@
                 <w:rFonts w:ascii="Inter" w:hAnsi="Inter"/>
                 <w:b/>
                 <w:bCs/>
-                <w:sz w:val="20"/>
-                <w:szCs w:val="20"/>
+                <w:sz w:val="18"/>
+                <w:szCs w:val="18"/>
               </w:rPr>
               <w:t>Individual Performance Management System (IPMS)</w:t>
             </w:r>
             <w:r>
               <w:rPr>
                 <w:rFonts w:ascii="Inter" w:hAnsi="Inter"/>
-                <w:sz w:val="20"/>
-                <w:szCs w:val="20"/>
+                <w:sz w:val="18"/>
+                <w:szCs w:val="18"/>
               </w:rPr>
               <w:t xml:space="preserve"> – </w:t>
             </w:r>
             <w:r>
               <w:rPr>
                 <w:rFonts w:ascii="Inter" w:hAnsi="Inter"/>
-                <w:sz w:val="20"/>
-                <w:szCs w:val="20"/>
+                <w:sz w:val="18"/>
+                <w:szCs w:val="18"/>
               </w:rPr>
               <w:t>a multi-tenant performance management platform for employees and supervisors to complete KPI scoring, competency assessments, and digital performance agreement signing.</w:t>
             </w:r>
@@ -2309,8 +2476,8 @@
               </w:numPr>
               <w:rPr>
                 <w:rFonts w:ascii="Inter" w:hAnsi="Inter"/>
-                <w:sz w:val="20"/>
-                <w:szCs w:val="20"/>
+                <w:sz w:val="18"/>
+                <w:szCs w:val="18"/>
               </w:rPr>
             </w:pPr>
             <w:r>
@@ -2320,16 +2487,16 @@
                 <w:bCs/>
                 <w:i/>
                 <w:iCs/>
-                <w:sz w:val="20"/>
-                <w:szCs w:val="20"/>
+                <w:sz w:val="18"/>
+                <w:szCs w:val="18"/>
               </w:rPr>
               <w:t>Performance Scoring Engine</w:t>
             </w:r>
             <w:r>
               <w:rPr>
                 <w:rFonts w:ascii="Inter" w:hAnsi="Inter"/>
-                <w:sz w:val="20"/>
-                <w:szCs w:val="20"/>
+                <w:sz w:val="18"/>
+                <w:szCs w:val="18"/>
               </w:rPr>
               <w:br/>
               <w:t>Implemented self-scoring, supervisor review and override</w:t>
@@ -2337,8 +2504,8 @@
             <w:r>
               <w:rPr>
                 <w:rFonts w:ascii="Inter" w:hAnsi="Inter"/>
-                <w:sz w:val="20"/>
-                <w:szCs w:val="20"/>
+                <w:sz w:val="18"/>
+                <w:szCs w:val="18"/>
               </w:rPr>
               <w:t>, weighted score finalization, automated bonus and raise calculation, digital signatures, and PoE file uploads.</w:t>
             </w:r>
@@ -2352,8 +2519,8 @@
               </w:numPr>
               <w:rPr>
                 <w:rFonts w:ascii="Inter" w:hAnsi="Inter"/>
-                <w:sz w:val="20"/>
-                <w:szCs w:val="20"/>
+                <w:sz w:val="18"/>
+                <w:szCs w:val="18"/>
               </w:rPr>
             </w:pPr>
             <w:r>
@@ -2363,8 +2530,8 @@
                 <w:bCs/>
                 <w:i/>
                 <w:iCs/>
-                <w:sz w:val="20"/>
-                <w:szCs w:val="20"/>
+                <w:sz w:val="18"/>
+                <w:szCs w:val="18"/>
               </w:rPr>
               <w:t>Performance Agreement</w:t>
             </w:r>
@@ -2373,142 +2540,18 @@
                 <w:rFonts w:ascii="Inter" w:hAnsi="Inter"/>
                 <w:i/>
                 <w:iCs/>
-                <w:sz w:val="20"/>
-                <w:szCs w:val="20"/>
+                <w:sz w:val="18"/>
+                <w:szCs w:val="18"/>
               </w:rPr>
               <w:br/>
             </w:r>
             <w:r>
               <w:rPr>
                 <w:rFonts w:ascii="Inter" w:hAnsi="Inter"/>
-                <w:sz w:val="20"/>
-                <w:szCs w:val="20"/>
+                <w:sz w:val="18"/>
+                <w:szCs w:val="18"/>
               </w:rPr>
               <w:t>Built tokenized document sharing, anonymous digital signing, and document retrieval workflows for employee performance agreements.</w:t>
-            </w:r>
-          </w:p>
-          <w:p>
-            <w:pPr>
-              <w:pStyle w:val="ListParagraph"/>
-              <w:numPr>
-                <w:ilvl w:val="0"/>
-                <w:numId w:val="3"/>
-              </w:numPr>
-              <w:rPr>
-                <w:rFonts w:ascii="Inter" w:hAnsi="Inter"/>
-                <w:sz w:val="20"/>
-                <w:szCs w:val="20"/>
-              </w:rPr>
-            </w:pPr>
-            <w:r>
-              <w:rPr>
-                <w:rFonts w:ascii="Inter" w:hAnsi="Inter"/>
-                <w:b/>
-                <w:bCs/>
-                <w:sz w:val="20"/>
-                <w:szCs w:val="20"/>
-              </w:rPr>
-              <w:t>IPMS Admin</w:t>
-            </w:r>
-            <w:r>
-              <w:rPr>
-                <w:rFonts w:ascii="Inter" w:hAnsi="Inter"/>
-                <w:sz w:val="20"/>
-                <w:szCs w:val="20"/>
-              </w:rPr>
-              <w:t xml:space="preserve"> – </w:t>
-            </w:r>
-            <w:r>
-              <w:rPr>
-                <w:rFonts w:ascii="Inter" w:hAnsi="Inter"/>
-                <w:sz w:val="20"/>
-                <w:szCs w:val="20"/>
-              </w:rPr>
-              <w:t>a multi-tenant, enterprise-grade administration portal for managing employee KPI and competency templates, configuring financial year and quarter settings, managing bonus and raise configurations, and controlling scoresheet distribution.</w:t>
-            </w:r>
-          </w:p>
-          <w:p>
-            <w:pPr>
-              <w:pStyle w:val="ListParagraph"/>
-              <w:numPr>
-                <w:ilvl w:val="1"/>
-                <w:numId w:val="3"/>
-              </w:numPr>
-              <w:rPr>
-                <w:rFonts w:ascii="Inter" w:hAnsi="Inter"/>
-                <w:sz w:val="20"/>
-                <w:szCs w:val="20"/>
-              </w:rPr>
-            </w:pPr>
-            <w:r>
-              <w:rPr>
-                <w:rFonts w:ascii="Inter" w:hAnsi="Inter"/>
-                <w:b/>
-                <w:bCs/>
-                <w:i/>
-                <w:iCs/>
-                <w:sz w:val="20"/>
-                <w:szCs w:val="20"/>
-              </w:rPr>
-              <w:t>KPA/KPI &amp; Competency Template Management</w:t>
-            </w:r>
-            <w:r>
-              <w:rPr>
-                <w:rFonts w:ascii="Inter" w:hAnsi="Inter"/>
-                <w:sz w:val="20"/>
-                <w:szCs w:val="20"/>
-              </w:rPr>
-              <w:br/>
-            </w:r>
-            <w:r>
-              <w:rPr>
-                <w:rFonts w:ascii="Inter" w:hAnsi="Inter"/>
-                <w:sz w:val="20"/>
-                <w:szCs w:val="20"/>
-              </w:rPr>
-              <w:t>Developed Excel bulk import, manual CRUD, cloning, grouping, bulk assignment, and rollout flows for KPA/KPI and competency templates.</w:t>
-            </w:r>
-          </w:p>
-          <w:p>
-            <w:pPr>
-              <w:pStyle w:val="ListParagraph"/>
-              <w:numPr>
-                <w:ilvl w:val="1"/>
-                <w:numId w:val="3"/>
-              </w:numPr>
-              <w:rPr>
-                <w:rFonts w:ascii="Inter" w:hAnsi="Inter"/>
-                <w:sz w:val="20"/>
-                <w:szCs w:val="20"/>
-              </w:rPr>
-            </w:pPr>
-            <w:r>
-              <w:rPr>
-                <w:rFonts w:ascii="Inter" w:hAnsi="Inter"/>
-                <w:b/>
-                <w:bCs/>
-                <w:i/>
-                <w:iCs/>
-                <w:sz w:val="20"/>
-                <w:szCs w:val="20"/>
-              </w:rPr>
-              <w:t>Reporting &amp; Analytics</w:t>
-            </w:r>
-            <w:r>
-              <w:rPr>
-                <w:rFonts w:ascii="Inter" w:hAnsi="Inter"/>
-                <w:sz w:val="20"/>
-                <w:szCs w:val="20"/>
-              </w:rPr>
-              <w:br/>
-            </w:r>
-            <w:r>
-              <w:rPr>
-                <w:rFonts w:ascii="Inter" w:hAnsi="Inter"/>
-                <w:sz w:val="20"/>
-                <w:szCs w:val="20"/>
-              </w:rPr>
-              <w:t>Developed multi-format export (xlsx, pdf) for Annual and Mid-Year performance summaries with paginated audit trail and department/supervisor/year filtering.</w:t>
             </w:r>
           </w:p>
         </w:tc>
@@ -2666,39 +2709,39 @@
               </w:tabs>
               <w:rPr>
                 <w:rFonts w:ascii="Inter" w:hAnsi="Inter"/>
-                <w:sz w:val="20"/>
-                <w:szCs w:val="20"/>
-              </w:rPr>
-            </w:pPr>
-            <w:r>
-              <w:rPr>
-                <w:rFonts w:ascii="Inter" w:hAnsi="Inter"/>
-                <w:sz w:val="20"/>
-                <w:szCs w:val="20"/>
+                <w:sz w:val="18"/>
+                <w:szCs w:val="18"/>
+              </w:rPr>
+            </w:pPr>
+            <w:r>
+              <w:rPr>
+                <w:rFonts w:ascii="Inter" w:hAnsi="Inter"/>
+                <w:sz w:val="18"/>
+                <w:szCs w:val="18"/>
               </w:rPr>
               <w:t>Angular (</w:t>
             </w:r>
             <w:r>
               <w:rPr>
                 <w:rFonts w:ascii="Inter" w:hAnsi="Inter"/>
-                <w:sz w:val="20"/>
-                <w:szCs w:val="20"/>
+                <w:sz w:val="18"/>
+                <w:szCs w:val="18"/>
               </w:rPr>
               <w:t>4</w:t>
             </w:r>
             <w:r>
               <w:rPr>
                 <w:rFonts w:ascii="Inter" w:hAnsi="Inter"/>
-                <w:sz w:val="20"/>
-                <w:szCs w:val="20"/>
+                <w:sz w:val="18"/>
+                <w:szCs w:val="18"/>
               </w:rPr>
               <w:t xml:space="preserve"> Years)</w:t>
             </w:r>
             <w:r>
               <w:rPr>
                 <w:rFonts w:ascii="Inter" w:hAnsi="Inter"/>
-                <w:sz w:val="20"/>
-                <w:szCs w:val="20"/>
+                <w:sz w:val="18"/>
+                <w:szCs w:val="18"/>
               </w:rPr>
               <w:tab/>
               <w:t>95%</w:t>
@@ -2708,16 +2751,16 @@
             <w:pPr>
               <w:rPr>
                 <w:rFonts w:ascii="Inter" w:hAnsi="Inter"/>
-                <w:sz w:val="20"/>
-                <w:szCs w:val="20"/>
+                <w:sz w:val="18"/>
+                <w:szCs w:val="18"/>
               </w:rPr>
             </w:pPr>
             <w:r>
               <w:rPr>
                 <w:rFonts w:ascii="Inter" w:hAnsi="Inter"/>
                 <w:noProof/>
-                <w:sz w:val="20"/>
-                <w:szCs w:val="20"/>
+                <w:sz w:val="18"/>
+                <w:szCs w:val="18"/>
               </w:rPr>
               <w:drawing>
                 <wp:inline distT="0" distB="0" distL="0" distR="0" wp14:anchorId="16D1D0C4" wp14:editId="0A42BC15">
@@ -2774,8 +2817,8 @@
             <w:pPr>
               <w:rPr>
                 <w:rFonts w:ascii="Inter" w:hAnsi="Inter"/>
-                <w:sz w:val="20"/>
-                <w:szCs w:val="20"/>
+                <w:sz w:val="18"/>
+                <w:szCs w:val="18"/>
               </w:rPr>
             </w:pPr>
           </w:p>
@@ -2786,63 +2829,63 @@
               </w:tabs>
               <w:rPr>
                 <w:rFonts w:ascii="Inter" w:hAnsi="Inter"/>
-                <w:sz w:val="20"/>
-                <w:szCs w:val="20"/>
-              </w:rPr>
-            </w:pPr>
-            <w:r>
-              <w:rPr>
-                <w:rFonts w:ascii="Inter" w:hAnsi="Inter"/>
-                <w:sz w:val="20"/>
-                <w:szCs w:val="20"/>
+                <w:sz w:val="18"/>
+                <w:szCs w:val="18"/>
+              </w:rPr>
+            </w:pPr>
+            <w:r>
+              <w:rPr>
+                <w:rFonts w:ascii="Inter" w:hAnsi="Inter"/>
+                <w:sz w:val="18"/>
+                <w:szCs w:val="18"/>
               </w:rPr>
               <w:t>HTML</w:t>
             </w:r>
             <w:r>
               <w:rPr>
                 <w:rFonts w:ascii="Inter" w:hAnsi="Inter"/>
-                <w:sz w:val="20"/>
-                <w:szCs w:val="20"/>
+                <w:sz w:val="18"/>
+                <w:szCs w:val="18"/>
               </w:rPr>
               <w:t xml:space="preserve"> (</w:t>
             </w:r>
             <w:r>
               <w:rPr>
                 <w:rFonts w:ascii="Inter" w:hAnsi="Inter"/>
-                <w:sz w:val="20"/>
-                <w:szCs w:val="20"/>
+                <w:sz w:val="18"/>
+                <w:szCs w:val="18"/>
               </w:rPr>
               <w:t>4</w:t>
             </w:r>
             <w:r>
               <w:rPr>
                 <w:rFonts w:ascii="Inter" w:hAnsi="Inter"/>
-                <w:sz w:val="20"/>
-                <w:szCs w:val="20"/>
+                <w:sz w:val="18"/>
+                <w:szCs w:val="18"/>
               </w:rPr>
               <w:t xml:space="preserve"> Years)</w:t>
             </w:r>
             <w:r>
               <w:rPr>
                 <w:rFonts w:ascii="Inter" w:hAnsi="Inter"/>
-                <w:sz w:val="20"/>
-                <w:szCs w:val="20"/>
+                <w:sz w:val="18"/>
+                <w:szCs w:val="18"/>
               </w:rPr>
               <w:tab/>
             </w:r>
             <w:r>
               <w:rPr>
                 <w:rFonts w:ascii="Inter" w:hAnsi="Inter"/>
-                <w:sz w:val="20"/>
-                <w:szCs w:val="20"/>
+                <w:sz w:val="18"/>
+                <w:szCs w:val="18"/>
               </w:rPr>
               <w:t>100</w:t>
             </w:r>
             <w:r>
               <w:rPr>
                 <w:rFonts w:ascii="Inter" w:hAnsi="Inter"/>
-                <w:sz w:val="20"/>
-                <w:szCs w:val="20"/>
+                <w:sz w:val="18"/>
+                <w:szCs w:val="18"/>
               </w:rPr>
               <w:t>%</w:t>
             </w:r>
@@ -2851,16 +2894,16 @@
             <w:pPr>
               <w:rPr>
                 <w:rFonts w:ascii="Inter" w:hAnsi="Inter"/>
-                <w:sz w:val="20"/>
-                <w:szCs w:val="20"/>
+                <w:sz w:val="18"/>
+                <w:szCs w:val="18"/>
               </w:rPr>
             </w:pPr>
             <w:r>
               <w:rPr>
                 <w:rFonts w:ascii="Inter" w:hAnsi="Inter"/>
                 <w:noProof/>
-                <w:sz w:val="20"/>
-                <w:szCs w:val="20"/>
+                <w:sz w:val="18"/>
+                <w:szCs w:val="18"/>
               </w:rPr>
               <w:drawing>
                 <wp:inline distT="0" distB="0" distL="0" distR="0" wp14:anchorId="1726CEC0" wp14:editId="46D653DF">
@@ -2917,8 +2960,8 @@
             <w:pPr>
               <w:rPr>
                 <w:rFonts w:ascii="Inter" w:hAnsi="Inter"/>
-                <w:sz w:val="20"/>
-                <w:szCs w:val="20"/>
+                <w:sz w:val="18"/>
+                <w:szCs w:val="18"/>
               </w:rPr>
             </w:pPr>
           </w:p>
@@ -2929,63 +2972,63 @@
               </w:tabs>
               <w:rPr>
                 <w:rFonts w:ascii="Inter" w:hAnsi="Inter"/>
-                <w:sz w:val="20"/>
-                <w:szCs w:val="20"/>
-              </w:rPr>
-            </w:pPr>
-            <w:r>
-              <w:rPr>
-                <w:rFonts w:ascii="Inter" w:hAnsi="Inter"/>
-                <w:sz w:val="20"/>
-                <w:szCs w:val="20"/>
+                <w:sz w:val="18"/>
+                <w:szCs w:val="18"/>
+              </w:rPr>
+            </w:pPr>
+            <w:r>
+              <w:rPr>
+                <w:rFonts w:ascii="Inter" w:hAnsi="Inter"/>
+                <w:sz w:val="18"/>
+                <w:szCs w:val="18"/>
               </w:rPr>
               <w:t>CSS</w:t>
             </w:r>
             <w:r>
               <w:rPr>
                 <w:rFonts w:ascii="Inter" w:hAnsi="Inter"/>
-                <w:sz w:val="20"/>
-                <w:szCs w:val="20"/>
+                <w:sz w:val="18"/>
+                <w:szCs w:val="18"/>
               </w:rPr>
               <w:t xml:space="preserve"> (</w:t>
             </w:r>
             <w:r>
               <w:rPr>
                 <w:rFonts w:ascii="Inter" w:hAnsi="Inter"/>
-                <w:sz w:val="20"/>
-                <w:szCs w:val="20"/>
+                <w:sz w:val="18"/>
+                <w:szCs w:val="18"/>
               </w:rPr>
               <w:t>4</w:t>
             </w:r>
             <w:r>
               <w:rPr>
                 <w:rFonts w:ascii="Inter" w:hAnsi="Inter"/>
-                <w:sz w:val="20"/>
-                <w:szCs w:val="20"/>
+                <w:sz w:val="18"/>
+                <w:szCs w:val="18"/>
               </w:rPr>
               <w:t xml:space="preserve"> Years)</w:t>
             </w:r>
             <w:r>
               <w:rPr>
                 <w:rFonts w:ascii="Inter" w:hAnsi="Inter"/>
-                <w:sz w:val="20"/>
-                <w:szCs w:val="20"/>
+                <w:sz w:val="18"/>
+                <w:szCs w:val="18"/>
               </w:rPr>
               <w:tab/>
             </w:r>
             <w:r>
               <w:rPr>
                 <w:rFonts w:ascii="Inter" w:hAnsi="Inter"/>
-                <w:sz w:val="20"/>
-                <w:szCs w:val="20"/>
+                <w:sz w:val="18"/>
+                <w:szCs w:val="18"/>
               </w:rPr>
               <w:t>100</w:t>
             </w:r>
             <w:r>
               <w:rPr>
                 <w:rFonts w:ascii="Inter" w:hAnsi="Inter"/>
-                <w:sz w:val="20"/>
-                <w:szCs w:val="20"/>
+                <w:sz w:val="18"/>
+                <w:szCs w:val="18"/>
               </w:rPr>
               <w:t>%</w:t>
             </w:r>
@@ -2994,16 +3037,16 @@
             <w:pPr>
               <w:rPr>
                 <w:rFonts w:ascii="Inter" w:hAnsi="Inter"/>
-                <w:sz w:val="20"/>
-                <w:szCs w:val="20"/>
+                <w:sz w:val="18"/>
+                <w:szCs w:val="18"/>
               </w:rPr>
             </w:pPr>
             <w:r>
               <w:rPr>
                 <w:rFonts w:ascii="Inter" w:hAnsi="Inter"/>
                 <w:noProof/>
-                <w:sz w:val="20"/>
-                <w:szCs w:val="20"/>
+                <w:sz w:val="18"/>
+                <w:szCs w:val="18"/>
               </w:rPr>
               <w:drawing>
                 <wp:inline distT="0" distB="0" distL="0" distR="0" wp14:anchorId="120335F3" wp14:editId="203969FF">
@@ -3060,8 +3103,8 @@
             <w:pPr>
               <w:rPr>
                 <w:rFonts w:ascii="Inter" w:hAnsi="Inter"/>
-                <w:sz w:val="20"/>
-                <w:szCs w:val="20"/>
+                <w:sz w:val="18"/>
+                <w:szCs w:val="18"/>
               </w:rPr>
             </w:pPr>
           </w:p>
@@ -3072,63 +3115,63 @@
               </w:tabs>
               <w:rPr>
                 <w:rFonts w:ascii="Inter" w:hAnsi="Inter"/>
-                <w:sz w:val="20"/>
-                <w:szCs w:val="20"/>
-              </w:rPr>
-            </w:pPr>
-            <w:r>
-              <w:rPr>
-                <w:rFonts w:ascii="Inter" w:hAnsi="Inter"/>
-                <w:sz w:val="20"/>
-                <w:szCs w:val="20"/>
+                <w:sz w:val="18"/>
+                <w:szCs w:val="18"/>
+              </w:rPr>
+            </w:pPr>
+            <w:r>
+              <w:rPr>
+                <w:rFonts w:ascii="Inter" w:hAnsi="Inter"/>
+                <w:sz w:val="18"/>
+                <w:szCs w:val="18"/>
               </w:rPr>
               <w:t>TypeScript</w:t>
             </w:r>
             <w:r>
               <w:rPr>
                 <w:rFonts w:ascii="Inter" w:hAnsi="Inter"/>
-                <w:sz w:val="20"/>
-                <w:szCs w:val="20"/>
+                <w:sz w:val="18"/>
+                <w:szCs w:val="18"/>
               </w:rPr>
               <w:t xml:space="preserve"> (</w:t>
             </w:r>
             <w:r>
               <w:rPr>
                 <w:rFonts w:ascii="Inter" w:hAnsi="Inter"/>
-                <w:sz w:val="20"/>
-                <w:szCs w:val="20"/>
+                <w:sz w:val="18"/>
+                <w:szCs w:val="18"/>
               </w:rPr>
               <w:t>4</w:t>
             </w:r>
             <w:r>
               <w:rPr>
                 <w:rFonts w:ascii="Inter" w:hAnsi="Inter"/>
-                <w:sz w:val="20"/>
-                <w:szCs w:val="20"/>
+                <w:sz w:val="18"/>
+                <w:szCs w:val="18"/>
               </w:rPr>
               <w:t xml:space="preserve"> Years)</w:t>
             </w:r>
             <w:r>
               <w:rPr>
                 <w:rFonts w:ascii="Inter" w:hAnsi="Inter"/>
-                <w:sz w:val="20"/>
-                <w:szCs w:val="20"/>
+                <w:sz w:val="18"/>
+                <w:szCs w:val="18"/>
               </w:rPr>
               <w:tab/>
             </w:r>
             <w:r>
               <w:rPr>
                 <w:rFonts w:ascii="Inter" w:hAnsi="Inter"/>
-                <w:sz w:val="20"/>
-                <w:szCs w:val="20"/>
+                <w:sz w:val="18"/>
+                <w:szCs w:val="18"/>
               </w:rPr>
               <w:t>90</w:t>
             </w:r>
             <w:r>
               <w:rPr>
                 <w:rFonts w:ascii="Inter" w:hAnsi="Inter"/>
-                <w:sz w:val="20"/>
-                <w:szCs w:val="20"/>
+                <w:sz w:val="18"/>
+                <w:szCs w:val="18"/>
               </w:rPr>
               <w:t>%</w:t>
             </w:r>
@@ -3137,16 +3180,16 @@
             <w:pPr>
               <w:rPr>
                 <w:rFonts w:ascii="Inter" w:hAnsi="Inter"/>
-                <w:sz w:val="20"/>
-                <w:szCs w:val="20"/>
+                <w:sz w:val="18"/>
+                <w:szCs w:val="18"/>
               </w:rPr>
             </w:pPr>
             <w:r>
               <w:rPr>
                 <w:rFonts w:ascii="Inter" w:hAnsi="Inter"/>
                 <w:noProof/>
-                <w:sz w:val="20"/>
-                <w:szCs w:val="20"/>
+                <w:sz w:val="18"/>
+                <w:szCs w:val="18"/>
               </w:rPr>
               <w:drawing>
                 <wp:inline distT="0" distB="0" distL="0" distR="0" wp14:anchorId="492527D2" wp14:editId="317588AB">
@@ -3203,8 +3246,8 @@
             <w:pPr>
               <w:rPr>
                 <w:rFonts w:ascii="Inter" w:hAnsi="Inter"/>
-                <w:sz w:val="20"/>
-                <w:szCs w:val="20"/>
+                <w:sz w:val="18"/>
+                <w:szCs w:val="18"/>
               </w:rPr>
             </w:pPr>
           </w:p>
@@ -3215,16 +3258,16 @@
               </w:tabs>
               <w:rPr>
                 <w:rFonts w:ascii="Inter" w:hAnsi="Inter"/>
-                <w:sz w:val="20"/>
-                <w:szCs w:val="20"/>
+                <w:sz w:val="18"/>
+                <w:szCs w:val="18"/>
               </w:rPr>
             </w:pPr>
             <w:proofErr w:type="spellStart"/>
             <w:r>
               <w:rPr>
                 <w:rFonts w:ascii="Inter" w:hAnsi="Inter"/>
-                <w:sz w:val="20"/>
-                <w:szCs w:val="20"/>
+                <w:sz w:val="18"/>
+                <w:szCs w:val="18"/>
               </w:rPr>
               <w:t>PrimeNG</w:t>
             </w:r>
@@ -3232,48 +3275,48 @@
             <w:r>
               <w:rPr>
                 <w:rFonts w:ascii="Inter" w:hAnsi="Inter"/>
-                <w:sz w:val="20"/>
-                <w:szCs w:val="20"/>
+                <w:sz w:val="18"/>
+                <w:szCs w:val="18"/>
               </w:rPr>
               <w:t xml:space="preserve"> (</w:t>
             </w:r>
             <w:r>
               <w:rPr>
                 <w:rFonts w:ascii="Inter" w:hAnsi="Inter"/>
-                <w:sz w:val="20"/>
-                <w:szCs w:val="20"/>
+                <w:sz w:val="18"/>
+                <w:szCs w:val="18"/>
               </w:rPr>
               <w:t>4</w:t>
             </w:r>
             <w:r>
               <w:rPr>
                 <w:rFonts w:ascii="Inter" w:hAnsi="Inter"/>
-                <w:sz w:val="20"/>
-                <w:szCs w:val="20"/>
+                <w:sz w:val="18"/>
+                <w:szCs w:val="18"/>
               </w:rPr>
               <w:t xml:space="preserve"> Years)</w:t>
             </w:r>
             <w:r>
               <w:rPr>
                 <w:rFonts w:ascii="Inter" w:hAnsi="Inter"/>
-                <w:sz w:val="20"/>
-                <w:szCs w:val="20"/>
+                <w:sz w:val="18"/>
+                <w:szCs w:val="18"/>
               </w:rPr>
               <w:tab/>
             </w:r>
             <w:r>
               <w:rPr>
                 <w:rFonts w:ascii="Inter" w:hAnsi="Inter"/>
-                <w:sz w:val="20"/>
-                <w:szCs w:val="20"/>
+                <w:sz w:val="18"/>
+                <w:szCs w:val="18"/>
               </w:rPr>
               <w:t>90</w:t>
             </w:r>
             <w:r>
               <w:rPr>
                 <w:rFonts w:ascii="Inter" w:hAnsi="Inter"/>
-                <w:sz w:val="20"/>
-                <w:szCs w:val="20"/>
+                <w:sz w:val="18"/>
+                <w:szCs w:val="18"/>
               </w:rPr>
               <w:t>%</w:t>
             </w:r>
@@ -3282,16 +3325,16 @@
             <w:pPr>
               <w:rPr>
                 <w:rFonts w:ascii="Inter" w:hAnsi="Inter"/>
-                <w:sz w:val="20"/>
-                <w:szCs w:val="20"/>
+                <w:sz w:val="18"/>
+                <w:szCs w:val="18"/>
               </w:rPr>
             </w:pPr>
             <w:r>
               <w:rPr>
                 <w:rFonts w:ascii="Inter" w:hAnsi="Inter"/>
                 <w:noProof/>
-                <w:sz w:val="20"/>
-                <w:szCs w:val="20"/>
+                <w:sz w:val="18"/>
+                <w:szCs w:val="18"/>
               </w:rPr>
               <w:drawing>
                 <wp:inline distT="0" distB="0" distL="0" distR="0" wp14:anchorId="36391402" wp14:editId="46C158CF">
@@ -3351,8 +3394,8 @@
               </w:tabs>
               <w:rPr>
                 <w:rFonts w:ascii="Inter" w:hAnsi="Inter"/>
-                <w:sz w:val="20"/>
-                <w:szCs w:val="20"/>
+                <w:sz w:val="18"/>
+                <w:szCs w:val="18"/>
               </w:rPr>
             </w:pPr>
           </w:p>
@@ -3363,47 +3406,23 @@
               </w:tabs>
               <w:rPr>
                 <w:rFonts w:ascii="Inter" w:hAnsi="Inter"/>
-                <w:sz w:val="20"/>
-                <w:szCs w:val="20"/>
-              </w:rPr>
-            </w:pPr>
-            <w:r>
-              <w:rPr>
-                <w:rFonts w:ascii="Inter" w:hAnsi="Inter"/>
-                <w:sz w:val="20"/>
-                <w:szCs w:val="20"/>
-              </w:rPr>
-              <w:t>Bootstrap</w:t>
-            </w:r>
-            <w:r>
-              <w:rPr>
-                <w:rFonts w:ascii="Inter" w:hAnsi="Inter"/>
-                <w:sz w:val="20"/>
-                <w:szCs w:val="20"/>
-              </w:rPr>
-              <w:t xml:space="preserve"> (</w:t>
-            </w:r>
-            <w:r>
-              <w:rPr>
-                <w:rFonts w:ascii="Inter" w:hAnsi="Inter"/>
-                <w:sz w:val="20"/>
-                <w:szCs w:val="20"/>
-              </w:rPr>
-              <w:t>4</w:t>
-            </w:r>
-            <w:r>
-              <w:rPr>
-                <w:rFonts w:ascii="Inter" w:hAnsi="Inter"/>
-                <w:sz w:val="20"/>
-                <w:szCs w:val="20"/>
-              </w:rPr>
-              <w:t xml:space="preserve"> Years)</w:t>
-            </w:r>
-            <w:r>
-              <w:rPr>
-                <w:rFonts w:ascii="Inter" w:hAnsi="Inter"/>
-                <w:sz w:val="20"/>
-                <w:szCs w:val="20"/>
+                <w:sz w:val="18"/>
+                <w:szCs w:val="18"/>
+              </w:rPr>
+            </w:pPr>
+            <w:r>
+              <w:rPr>
+                <w:rFonts w:ascii="Inter" w:hAnsi="Inter"/>
+                <w:sz w:val="18"/>
+                <w:szCs w:val="18"/>
+              </w:rPr>
+              <w:t>Bootstrap (4 Years)</w:t>
+            </w:r>
+            <w:r>
+              <w:rPr>
+                <w:rFonts w:ascii="Inter" w:hAnsi="Inter"/>
+                <w:sz w:val="18"/>
+                <w:szCs w:val="18"/>
               </w:rPr>
               <w:tab/>
               <w:t>90%</w:t>
@@ -3413,16 +3432,16 @@
             <w:pPr>
               <w:rPr>
                 <w:rFonts w:ascii="Inter" w:hAnsi="Inter"/>
-                <w:sz w:val="20"/>
-                <w:szCs w:val="20"/>
+                <w:sz w:val="18"/>
+                <w:szCs w:val="18"/>
               </w:rPr>
             </w:pPr>
             <w:r>
               <w:rPr>
                 <w:rFonts w:ascii="Inter" w:hAnsi="Inter"/>
                 <w:noProof/>
-                <w:sz w:val="20"/>
-                <w:szCs w:val="20"/>
+                <w:sz w:val="18"/>
+                <w:szCs w:val="18"/>
               </w:rPr>
               <w:drawing>
                 <wp:inline distT="0" distB="0" distL="0" distR="0" wp14:anchorId="71E9DAA6" wp14:editId="33761295">
@@ -3479,8 +3498,8 @@
             <w:pPr>
               <w:rPr>
                 <w:rFonts w:ascii="Inter" w:hAnsi="Inter"/>
-                <w:sz w:val="20"/>
-                <w:szCs w:val="20"/>
+                <w:sz w:val="18"/>
+                <w:szCs w:val="18"/>
               </w:rPr>
             </w:pPr>
           </w:p>
@@ -3491,71 +3510,71 @@
               </w:tabs>
               <w:rPr>
                 <w:rFonts w:ascii="Inter" w:hAnsi="Inter"/>
-                <w:sz w:val="20"/>
-                <w:szCs w:val="20"/>
-              </w:rPr>
-            </w:pPr>
-            <w:r>
-              <w:rPr>
-                <w:rFonts w:ascii="Inter" w:hAnsi="Inter"/>
-                <w:sz w:val="20"/>
-                <w:szCs w:val="20"/>
+                <w:sz w:val="18"/>
+                <w:szCs w:val="18"/>
+              </w:rPr>
+            </w:pPr>
+            <w:r>
+              <w:rPr>
+                <w:rFonts w:ascii="Inter" w:hAnsi="Inter"/>
+                <w:sz w:val="18"/>
+                <w:szCs w:val="18"/>
               </w:rPr>
               <w:t>C</w:t>
             </w:r>
             <w:r>
               <w:rPr>
                 <w:rFonts w:ascii="Inter" w:hAnsi="Inter"/>
-                <w:sz w:val="20"/>
-                <w:szCs w:val="20"/>
+                <w:sz w:val="18"/>
+                <w:szCs w:val="18"/>
               </w:rPr>
               <w:t>#</w:t>
             </w:r>
             <w:r>
               <w:rPr>
                 <w:rFonts w:ascii="Inter" w:hAnsi="Inter"/>
-                <w:sz w:val="20"/>
-                <w:szCs w:val="20"/>
+                <w:sz w:val="18"/>
+                <w:szCs w:val="18"/>
               </w:rPr>
               <w:t xml:space="preserve"> (</w:t>
             </w:r>
             <w:r>
               <w:rPr>
                 <w:rFonts w:ascii="Inter" w:hAnsi="Inter"/>
-                <w:sz w:val="20"/>
-                <w:szCs w:val="20"/>
+                <w:sz w:val="18"/>
+                <w:szCs w:val="18"/>
               </w:rPr>
               <w:t>1</w:t>
             </w:r>
             <w:r>
               <w:rPr>
                 <w:rFonts w:ascii="Inter" w:hAnsi="Inter"/>
-                <w:sz w:val="20"/>
-                <w:szCs w:val="20"/>
+                <w:sz w:val="18"/>
+                <w:szCs w:val="18"/>
               </w:rPr>
               <w:t xml:space="preserve"> Year)</w:t>
             </w:r>
             <w:r>
               <w:rPr>
                 <w:rFonts w:ascii="Inter" w:hAnsi="Inter"/>
-                <w:sz w:val="20"/>
-                <w:szCs w:val="20"/>
+                <w:sz w:val="18"/>
+                <w:szCs w:val="18"/>
               </w:rPr>
               <w:tab/>
             </w:r>
             <w:r>
               <w:rPr>
                 <w:rFonts w:ascii="Inter" w:hAnsi="Inter"/>
-                <w:sz w:val="20"/>
-                <w:szCs w:val="20"/>
+                <w:sz w:val="18"/>
+                <w:szCs w:val="18"/>
               </w:rPr>
               <w:t>50</w:t>
             </w:r>
             <w:r>
               <w:rPr>
                 <w:rFonts w:ascii="Inter" w:hAnsi="Inter"/>
-                <w:sz w:val="20"/>
-                <w:szCs w:val="20"/>
+                <w:sz w:val="18"/>
+                <w:szCs w:val="18"/>
               </w:rPr>
               <w:t>%</w:t>
             </w:r>
@@ -3564,16 +3583,16 @@
             <w:pPr>
               <w:rPr>
                 <w:rFonts w:ascii="Inter" w:hAnsi="Inter"/>
-                <w:sz w:val="20"/>
-                <w:szCs w:val="20"/>
+                <w:sz w:val="18"/>
+                <w:szCs w:val="18"/>
               </w:rPr>
             </w:pPr>
             <w:r>
               <w:rPr>
                 <w:rFonts w:ascii="Inter" w:hAnsi="Inter"/>
                 <w:noProof/>
-                <w:sz w:val="20"/>
-                <w:szCs w:val="20"/>
+                <w:sz w:val="18"/>
+                <w:szCs w:val="18"/>
               </w:rPr>
               <w:drawing>
                 <wp:inline distT="0" distB="0" distL="0" distR="0" wp14:anchorId="4B0BB8E7" wp14:editId="1BC14352">
@@ -3630,8 +3649,8 @@
             <w:pPr>
               <w:rPr>
                 <w:rFonts w:ascii="Inter" w:hAnsi="Inter"/>
-                <w:sz w:val="20"/>
-                <w:szCs w:val="20"/>
+                <w:sz w:val="18"/>
+                <w:szCs w:val="18"/>
               </w:rPr>
             </w:pPr>
           </w:p>
@@ -3642,71 +3661,71 @@
               </w:tabs>
               <w:rPr>
                 <w:rFonts w:ascii="Inter" w:hAnsi="Inter"/>
-                <w:sz w:val="20"/>
-                <w:szCs w:val="20"/>
-              </w:rPr>
-            </w:pPr>
-            <w:r>
-              <w:rPr>
-                <w:rFonts w:ascii="Inter" w:hAnsi="Inter"/>
-                <w:sz w:val="20"/>
-                <w:szCs w:val="20"/>
+                <w:sz w:val="18"/>
+                <w:szCs w:val="18"/>
+              </w:rPr>
+            </w:pPr>
+            <w:r>
+              <w:rPr>
+                <w:rFonts w:ascii="Inter" w:hAnsi="Inter"/>
+                <w:sz w:val="18"/>
+                <w:szCs w:val="18"/>
               </w:rPr>
               <w:t xml:space="preserve">Azure </w:t>
             </w:r>
             <w:r>
               <w:rPr>
                 <w:rFonts w:ascii="Inter" w:hAnsi="Inter"/>
-                <w:sz w:val="20"/>
-                <w:szCs w:val="20"/>
+                <w:sz w:val="18"/>
+                <w:szCs w:val="18"/>
               </w:rPr>
               <w:t>SQL</w:t>
             </w:r>
             <w:r>
               <w:rPr>
                 <w:rFonts w:ascii="Inter" w:hAnsi="Inter"/>
-                <w:sz w:val="20"/>
-                <w:szCs w:val="20"/>
+                <w:sz w:val="18"/>
+                <w:szCs w:val="18"/>
               </w:rPr>
               <w:t xml:space="preserve"> (</w:t>
             </w:r>
             <w:r>
               <w:rPr>
                 <w:rFonts w:ascii="Inter" w:hAnsi="Inter"/>
-                <w:sz w:val="20"/>
-                <w:szCs w:val="20"/>
+                <w:sz w:val="18"/>
+                <w:szCs w:val="18"/>
               </w:rPr>
               <w:t>1</w:t>
             </w:r>
             <w:r>
               <w:rPr>
                 <w:rFonts w:ascii="Inter" w:hAnsi="Inter"/>
-                <w:sz w:val="20"/>
-                <w:szCs w:val="20"/>
+                <w:sz w:val="18"/>
+                <w:szCs w:val="18"/>
               </w:rPr>
               <w:t xml:space="preserve"> Year)</w:t>
             </w:r>
             <w:r>
               <w:rPr>
                 <w:rFonts w:ascii="Inter" w:hAnsi="Inter"/>
-                <w:sz w:val="20"/>
-                <w:szCs w:val="20"/>
+                <w:sz w:val="18"/>
+                <w:szCs w:val="18"/>
               </w:rPr>
               <w:tab/>
             </w:r>
             <w:r>
               <w:rPr>
                 <w:rFonts w:ascii="Inter" w:hAnsi="Inter"/>
-                <w:sz w:val="20"/>
-                <w:szCs w:val="20"/>
+                <w:sz w:val="18"/>
+                <w:szCs w:val="18"/>
               </w:rPr>
               <w:t>30</w:t>
             </w:r>
             <w:r>
               <w:rPr>
                 <w:rFonts w:ascii="Inter" w:hAnsi="Inter"/>
-                <w:sz w:val="20"/>
-                <w:szCs w:val="20"/>
+                <w:sz w:val="18"/>
+                <w:szCs w:val="18"/>
               </w:rPr>
               <w:t>%</w:t>
             </w:r>
@@ -3715,16 +3734,16 @@
             <w:pPr>
               <w:rPr>
                 <w:rFonts w:ascii="Inter" w:hAnsi="Inter"/>
-                <w:sz w:val="20"/>
-                <w:szCs w:val="20"/>
+                <w:sz w:val="18"/>
+                <w:szCs w:val="18"/>
               </w:rPr>
             </w:pPr>
             <w:r>
               <w:rPr>
                 <w:rFonts w:ascii="Inter" w:hAnsi="Inter"/>
                 <w:noProof/>
-                <w:sz w:val="20"/>
-                <w:szCs w:val="20"/>
+                <w:sz w:val="18"/>
+                <w:szCs w:val="18"/>
               </w:rPr>
               <w:drawing>
                 <wp:inline distT="0" distB="0" distL="0" distR="0" wp14:anchorId="3BE8FF8C" wp14:editId="74A06F27">
@@ -3781,8 +3800,8 @@
             <w:pPr>
               <w:rPr>
                 <w:rFonts w:ascii="Inter" w:hAnsi="Inter"/>
-                <w:sz w:val="20"/>
-                <w:szCs w:val="20"/>
+                <w:sz w:val="18"/>
+                <w:szCs w:val="18"/>
               </w:rPr>
             </w:pPr>
           </w:p>
@@ -3793,47 +3812,47 @@
               </w:tabs>
               <w:rPr>
                 <w:rFonts w:ascii="Inter" w:hAnsi="Inter"/>
-                <w:sz w:val="20"/>
-                <w:szCs w:val="20"/>
-              </w:rPr>
-            </w:pPr>
-            <w:r>
-              <w:rPr>
-                <w:rFonts w:ascii="Inter" w:hAnsi="Inter"/>
-                <w:sz w:val="20"/>
-                <w:szCs w:val="20"/>
+                <w:sz w:val="18"/>
+                <w:szCs w:val="18"/>
+              </w:rPr>
+            </w:pPr>
+            <w:r>
+              <w:rPr>
+                <w:rFonts w:ascii="Inter" w:hAnsi="Inter"/>
+                <w:sz w:val="18"/>
+                <w:szCs w:val="18"/>
               </w:rPr>
               <w:t>Azure</w:t>
             </w:r>
             <w:r>
               <w:rPr>
                 <w:rFonts w:ascii="Inter" w:hAnsi="Inter"/>
-                <w:sz w:val="20"/>
-                <w:szCs w:val="20"/>
+                <w:sz w:val="18"/>
+                <w:szCs w:val="18"/>
               </w:rPr>
               <w:t xml:space="preserve"> Portal</w:t>
             </w:r>
             <w:r>
               <w:rPr>
                 <w:rFonts w:ascii="Inter" w:hAnsi="Inter"/>
-                <w:sz w:val="20"/>
-                <w:szCs w:val="20"/>
+                <w:sz w:val="18"/>
+                <w:szCs w:val="18"/>
               </w:rPr>
               <w:tab/>
             </w:r>
             <w:r>
               <w:rPr>
                 <w:rFonts w:ascii="Inter" w:hAnsi="Inter"/>
-                <w:sz w:val="20"/>
-                <w:szCs w:val="20"/>
+                <w:sz w:val="18"/>
+                <w:szCs w:val="18"/>
               </w:rPr>
               <w:t>20</w:t>
             </w:r>
             <w:r>
               <w:rPr>
                 <w:rFonts w:ascii="Inter" w:hAnsi="Inter"/>
-                <w:sz w:val="20"/>
-                <w:szCs w:val="20"/>
+                <w:sz w:val="18"/>
+                <w:szCs w:val="18"/>
               </w:rPr>
               <w:t>%</w:t>
             </w:r>
@@ -3842,16 +3861,16 @@
             <w:pPr>
               <w:rPr>
                 <w:rFonts w:ascii="Inter" w:hAnsi="Inter"/>
-                <w:sz w:val="20"/>
-                <w:szCs w:val="20"/>
+                <w:sz w:val="18"/>
+                <w:szCs w:val="18"/>
               </w:rPr>
             </w:pPr>
             <w:r>
               <w:rPr>
                 <w:rFonts w:ascii="Inter" w:hAnsi="Inter"/>
                 <w:noProof/>
-                <w:sz w:val="20"/>
-                <w:szCs w:val="20"/>
+                <w:sz w:val="18"/>
+                <w:szCs w:val="18"/>
               </w:rPr>
               <w:drawing>
                 <wp:inline distT="0" distB="0" distL="0" distR="0" wp14:anchorId="590297A0" wp14:editId="537FAB4B">
@@ -3908,8 +3927,8 @@
             <w:pPr>
               <w:rPr>
                 <w:rFonts w:ascii="Inter" w:hAnsi="Inter"/>
-                <w:sz w:val="20"/>
-                <w:szCs w:val="20"/>
+                <w:sz w:val="18"/>
+                <w:szCs w:val="18"/>
               </w:rPr>
             </w:pPr>
           </w:p>
@@ -3920,31 +3939,31 @@
               </w:tabs>
               <w:rPr>
                 <w:rFonts w:ascii="Inter" w:hAnsi="Inter"/>
-                <w:sz w:val="20"/>
-                <w:szCs w:val="20"/>
-              </w:rPr>
-            </w:pPr>
-            <w:r>
-              <w:rPr>
-                <w:rFonts w:ascii="Inter" w:hAnsi="Inter"/>
-                <w:sz w:val="20"/>
-                <w:szCs w:val="20"/>
+                <w:sz w:val="18"/>
+                <w:szCs w:val="18"/>
+              </w:rPr>
+            </w:pPr>
+            <w:r>
+              <w:rPr>
+                <w:rFonts w:ascii="Inter" w:hAnsi="Inter"/>
+                <w:sz w:val="18"/>
+                <w:szCs w:val="18"/>
               </w:rPr>
               <w:t xml:space="preserve">ORM using </w:t>
             </w:r>
             <w:r>
               <w:rPr>
                 <w:rFonts w:ascii="Inter" w:hAnsi="Inter"/>
-                <w:sz w:val="20"/>
-                <w:szCs w:val="20"/>
+                <w:sz w:val="18"/>
+                <w:szCs w:val="18"/>
               </w:rPr>
               <w:t>EF Core</w:t>
             </w:r>
             <w:r>
               <w:rPr>
                 <w:rFonts w:ascii="Inter" w:hAnsi="Inter"/>
-                <w:sz w:val="20"/>
-                <w:szCs w:val="20"/>
+                <w:sz w:val="18"/>
+                <w:szCs w:val="18"/>
               </w:rPr>
               <w:tab/>
               <w:t>10%</w:t>
@@ -4028,6 +4047,13 @@
         </w:tc>
       </w:tr>
     </w:tbl>
+    <w:p>
+      <w:pPr>
+        <w:rPr>
+          <w:rFonts w:ascii="Inter" w:hAnsi="Inter"/>
+        </w:rPr>
+      </w:pPr>
+    </w:p>
     <w:p>
       <w:pPr>
         <w:rPr>
@@ -4248,8 +4274,8 @@
                 <w:bCs/>
                 <w:i/>
                 <w:iCs/>
-                <w:sz w:val="20"/>
-                <w:szCs w:val="20"/>
+                <w:sz w:val="18"/>
+                <w:szCs w:val="18"/>
               </w:rPr>
             </w:pPr>
             <w:r>
@@ -4259,8 +4285,8 @@
                 <w:bCs/>
                 <w:i/>
                 <w:iCs/>
-                <w:sz w:val="20"/>
-                <w:szCs w:val="20"/>
+                <w:sz w:val="18"/>
+                <w:szCs w:val="18"/>
               </w:rPr>
               <w:t xml:space="preserve">Azure Functions &amp; Background Service </w:t>
             </w:r>
@@ -4271,16 +4297,16 @@
                 <w:bCs/>
                 <w:i/>
                 <w:iCs/>
-                <w:sz w:val="20"/>
-                <w:szCs w:val="20"/>
+                <w:sz w:val="18"/>
+                <w:szCs w:val="18"/>
               </w:rPr>
               <w:br/>
             </w:r>
             <w:r>
               <w:rPr>
                 <w:rFonts w:ascii="Inter" w:hAnsi="Inter"/>
-                <w:sz w:val="20"/>
-                <w:szCs w:val="20"/>
+                <w:sz w:val="18"/>
+                <w:szCs w:val="18"/>
               </w:rPr>
               <w:t>Built Service Bus-triggered functions for email processing, scoring template generation, and scheduled invites, alongside a Timer-triggered daily job for automatic quarter progression and email reminders.</w:t>
             </w:r>
@@ -4296,8 +4322,8 @@
                 <w:rFonts w:ascii="Inter" w:hAnsi="Inter"/>
                 <w:b/>
                 <w:bCs/>
-                <w:sz w:val="20"/>
-                <w:szCs w:val="20"/>
+                <w:sz w:val="18"/>
+                <w:szCs w:val="18"/>
               </w:rPr>
             </w:pPr>
             <w:proofErr w:type="spellStart"/>
@@ -4306,8 +4332,8 @@
                 <w:rFonts w:ascii="Inter" w:hAnsi="Inter"/>
                 <w:b/>
                 <w:bCs/>
-                <w:sz w:val="20"/>
-                <w:szCs w:val="20"/>
+                <w:sz w:val="18"/>
+                <w:szCs w:val="18"/>
               </w:rPr>
               <w:t>Organisational</w:t>
             </w:r>
@@ -4317,28 +4343,50 @@
                 <w:rFonts w:ascii="Inter" w:hAnsi="Inter"/>
                 <w:b/>
                 <w:bCs/>
-                <w:sz w:val="20"/>
-                <w:szCs w:val="20"/>
-              </w:rPr>
-              <w:t xml:space="preserve"> Performance Management System</w:t>
-            </w:r>
+                <w:sz w:val="18"/>
+                <w:szCs w:val="18"/>
+              </w:rPr>
+              <w:t xml:space="preserve"> Performance Management System (OPMS) </w:t>
+            </w:r>
+            <w:r>
+              <w:rPr>
+                <w:rFonts w:ascii="Inter" w:hAnsi="Inter"/>
+                <w:sz w:val="18"/>
+                <w:szCs w:val="18"/>
+              </w:rPr>
+              <w:t>– a multi-tenant, enterprise-grade government platform designed to streamline organizational performance tracking, KPI management, multi-level approval workflows, and compliance reporting across departments.</w:t>
+            </w:r>
+          </w:p>
+          <w:p>
+            <w:pPr>
+              <w:pStyle w:val="ListParagraph"/>
+              <w:numPr>
+                <w:ilvl w:val="0"/>
+                <w:numId w:val="3"/>
+              </w:numPr>
+              <w:rPr>
+                <w:rFonts w:ascii="Inter" w:hAnsi="Inter"/>
+                <w:sz w:val="18"/>
+                <w:szCs w:val="18"/>
+              </w:rPr>
+            </w:pPr>
             <w:r>
               <w:rPr>
                 <w:rFonts w:ascii="Inter" w:hAnsi="Inter"/>
                 <w:b/>
                 <w:bCs/>
-                <w:sz w:val="20"/>
-                <w:szCs w:val="20"/>
-              </w:rPr>
-              <w:t xml:space="preserve"> (OPMS) </w:t>
-            </w:r>
-            <w:r>
-              <w:rPr>
-                <w:rFonts w:ascii="Inter" w:hAnsi="Inter"/>
-                <w:sz w:val="20"/>
-                <w:szCs w:val="20"/>
-              </w:rPr>
-              <w:t>– a multi-tenant, enterprise-grade government platform designed to streamline organizational performance tracking, KPI management, multi-level approval workflows, and compliance reporting across departments.</w:t>
+                <w:sz w:val="18"/>
+                <w:szCs w:val="18"/>
+              </w:rPr>
+              <w:t>IPMS Admin</w:t>
+            </w:r>
+            <w:r>
+              <w:rPr>
+                <w:rFonts w:ascii="Inter" w:hAnsi="Inter"/>
+                <w:sz w:val="18"/>
+                <w:szCs w:val="18"/>
+              </w:rPr>
+              <w:t xml:space="preserve"> – a multi-tenant, enterprise-grade administration portal for managing employee KPI and competency templates, configuring financial year and quarter settings, managing bonus and raise configurations, and controlling scoresheet distribution.</w:t>
             </w:r>
           </w:p>
           <w:p>
@@ -4350,10 +4398,8 @@
               </w:numPr>
               <w:rPr>
                 <w:rFonts w:ascii="Inter" w:hAnsi="Inter"/>
-                <w:i/>
-                <w:iCs/>
-                <w:sz w:val="20"/>
-                <w:szCs w:val="20"/>
+                <w:sz w:val="18"/>
+                <w:szCs w:val="18"/>
               </w:rPr>
             </w:pPr>
             <w:r>
@@ -4363,28 +4409,19 @@
                 <w:bCs/>
                 <w:i/>
                 <w:iCs/>
-                <w:sz w:val="20"/>
-                <w:szCs w:val="20"/>
-              </w:rPr>
-              <w:t>KPI Lifecycle Management</w:t>
-            </w:r>
-            <w:r>
-              <w:rPr>
-                <w:rFonts w:ascii="Inter" w:hAnsi="Inter"/>
-                <w:i/>
-                <w:iCs/>
-                <w:sz w:val="20"/>
-                <w:szCs w:val="20"/>
+                <w:sz w:val="18"/>
+                <w:szCs w:val="18"/>
+              </w:rPr>
+              <w:t>KPA/KPI &amp; Competency Template Management</w:t>
+            </w:r>
+            <w:r>
+              <w:rPr>
+                <w:rFonts w:ascii="Inter" w:hAnsi="Inter"/>
+                <w:sz w:val="18"/>
+                <w:szCs w:val="18"/>
               </w:rPr>
               <w:br/>
-            </w:r>
-            <w:r>
-              <w:rPr>
-                <w:rFonts w:ascii="Inter" w:hAnsi="Inter"/>
-                <w:sz w:val="20"/>
-                <w:szCs w:val="20"/>
-              </w:rPr>
-              <w:t>Designed and implemented full CRUD for Key Performance Indicator (KPI) definitions, as well as period-specific scheduling, actual value submission, rating and scoring system, and file upload support.</w:t>
+              <w:t>Developed Excel bulk import, manual CRUD, cloning, grouping, bulk assignment, and rollout flows for KPA/KPI and competency templates.</w:t>
             </w:r>
           </w:p>
           <w:p>
@@ -4396,10 +4433,8 @@
               </w:numPr>
               <w:rPr>
                 <w:rFonts w:ascii="Inter" w:hAnsi="Inter"/>
-                <w:i/>
-                <w:iCs/>
-                <w:sz w:val="20"/>
-                <w:szCs w:val="20"/>
+                <w:sz w:val="18"/>
+                <w:szCs w:val="18"/>
               </w:rPr>
             </w:pPr>
             <w:r>
@@ -4409,19 +4444,19 @@
                 <w:bCs/>
                 <w:i/>
                 <w:iCs/>
-                <w:sz w:val="20"/>
-                <w:szCs w:val="20"/>
-              </w:rPr>
-              <w:t>Multi-Level Approval Workflow</w:t>
-            </w:r>
-            <w:r>
-              <w:rPr>
-                <w:rFonts w:ascii="Inter" w:hAnsi="Inter"/>
-                <w:sz w:val="20"/>
-                <w:szCs w:val="20"/>
+                <w:sz w:val="18"/>
+                <w:szCs w:val="18"/>
+              </w:rPr>
+              <w:t>Reporting &amp; Analytics</w:t>
+            </w:r>
+            <w:r>
+              <w:rPr>
+                <w:rFonts w:ascii="Inter" w:hAnsi="Inter"/>
+                <w:sz w:val="18"/>
+                <w:szCs w:val="18"/>
               </w:rPr>
               <w:br/>
-              <w:t>Engineered a configurable approval chain, such as approval, rejections, and resubmission flows.</w:t>
+              <w:t>Developed multi-format export (xlsx, pdf) for Annual and Mid-Year performance summaries with paginated audit trail and department/supervisor/year filtering.</w:t>
             </w:r>
           </w:p>
           <w:p>
@@ -4435,8 +4470,8 @@
                 <w:rFonts w:ascii="Inter" w:hAnsi="Inter"/>
                 <w:i/>
                 <w:iCs/>
-                <w:sz w:val="20"/>
-                <w:szCs w:val="20"/>
+                <w:sz w:val="18"/>
+                <w:szCs w:val="18"/>
               </w:rPr>
             </w:pPr>
             <w:r>
@@ -4446,30 +4481,28 @@
                 <w:bCs/>
                 <w:i/>
                 <w:iCs/>
-                <w:sz w:val="20"/>
-                <w:szCs w:val="20"/>
-              </w:rPr>
-              <w:t>Service Delivery &amp; Budget Implementation Plan (SDBIP)</w:t>
-            </w:r>
-            <w:r>
-              <w:rPr>
-                <w:rFonts w:ascii="Inter" w:hAnsi="Inter"/>
-                <w:b/>
-                <w:bCs/>
+                <w:sz w:val="18"/>
+                <w:szCs w:val="18"/>
+              </w:rPr>
+              <w:t>KPI Lifecycle Management</w:t>
+            </w:r>
+            <w:r>
+              <w:rPr>
+                <w:rFonts w:ascii="Inter" w:hAnsi="Inter"/>
                 <w:i/>
                 <w:iCs/>
-                <w:sz w:val="20"/>
-                <w:szCs w:val="20"/>
+                <w:sz w:val="18"/>
+                <w:szCs w:val="18"/>
               </w:rPr>
               <w:br/>
             </w:r>
             <w:r>
               <w:rPr>
                 <w:rFonts w:ascii="Inter" w:hAnsi="Inter"/>
-                <w:sz w:val="20"/>
-                <w:szCs w:val="20"/>
-              </w:rPr>
-              <w:t>Built project management features with account and expenditure link.</w:t>
+                <w:sz w:val="18"/>
+                <w:szCs w:val="18"/>
+              </w:rPr>
+              <w:t>Designed and implemented full CRUD for Key Performance Indicator (KPI) definitions, as well as period-specific scheduling, actual value submission, rating and scoring system, and file upload support.</w:t>
             </w:r>
           </w:p>
           <w:p>
@@ -4483,8 +4516,8 @@
                 <w:rFonts w:ascii="Inter" w:hAnsi="Inter"/>
                 <w:i/>
                 <w:iCs/>
-                <w:sz w:val="20"/>
-                <w:szCs w:val="20"/>
+                <w:sz w:val="18"/>
+                <w:szCs w:val="18"/>
               </w:rPr>
             </w:pPr>
             <w:r>
@@ -4494,28 +4527,19 @@
                 <w:bCs/>
                 <w:i/>
                 <w:iCs/>
-                <w:sz w:val="20"/>
-                <w:szCs w:val="20"/>
-              </w:rPr>
-              <w:t>Budget &amp; Financial Tracking</w:t>
-            </w:r>
-            <w:r>
-              <w:rPr>
-                <w:rFonts w:ascii="Inter" w:hAnsi="Inter"/>
-                <w:i/>
-                <w:iCs/>
-                <w:sz w:val="20"/>
-                <w:szCs w:val="20"/>
+                <w:sz w:val="18"/>
+                <w:szCs w:val="18"/>
+              </w:rPr>
+              <w:t>Multi-Level Approval Workflow</w:t>
+            </w:r>
+            <w:r>
+              <w:rPr>
+                <w:rFonts w:ascii="Inter" w:hAnsi="Inter"/>
+                <w:sz w:val="18"/>
+                <w:szCs w:val="18"/>
               </w:rPr>
               <w:br/>
-            </w:r>
-            <w:r>
-              <w:rPr>
-                <w:rFonts w:ascii="Inter" w:hAnsi="Inter"/>
-                <w:sz w:val="20"/>
-                <w:szCs w:val="20"/>
-              </w:rPr>
-              <w:t>Developed bulk import pipelines via Excel / CSV, with budget line tracking and reporting per KPI.</w:t>
+              <w:t>Engineered a configurable approval chain, such as approval, rejections, and resubmission flows.</w:t>
             </w:r>
           </w:p>
           <w:p>
@@ -4529,8 +4553,8 @@
                 <w:rFonts w:ascii="Inter" w:hAnsi="Inter"/>
                 <w:i/>
                 <w:iCs/>
-                <w:sz w:val="20"/>
-                <w:szCs w:val="20"/>
+                <w:sz w:val="18"/>
+                <w:szCs w:val="18"/>
               </w:rPr>
             </w:pPr>
             <w:r>
@@ -4540,28 +4564,30 @@
                 <w:bCs/>
                 <w:i/>
                 <w:iCs/>
-                <w:sz w:val="20"/>
-                <w:szCs w:val="20"/>
-              </w:rPr>
-              <w:t>Reporting &amp; Analytics</w:t>
-            </w:r>
-            <w:r>
-              <w:rPr>
-                <w:rFonts w:ascii="Inter" w:hAnsi="Inter"/>
+                <w:sz w:val="18"/>
+                <w:szCs w:val="18"/>
+              </w:rPr>
+              <w:t>Service Delivery &amp; Budget Implementation Plan (SDBIP)</w:t>
+            </w:r>
+            <w:r>
+              <w:rPr>
+                <w:rFonts w:ascii="Inter" w:hAnsi="Inter"/>
+                <w:b/>
+                <w:bCs/>
                 <w:i/>
                 <w:iCs/>
-                <w:sz w:val="20"/>
-                <w:szCs w:val="20"/>
+                <w:sz w:val="18"/>
+                <w:szCs w:val="18"/>
               </w:rPr>
               <w:br/>
             </w:r>
             <w:r>
               <w:rPr>
                 <w:rFonts w:ascii="Inter" w:hAnsi="Inter"/>
-                <w:sz w:val="20"/>
-                <w:szCs w:val="20"/>
-              </w:rPr>
-              <w:t>Developed multi-format export (xlsx, pdf, docx) for KPA Performance Report</w:t>
+                <w:sz w:val="18"/>
+                <w:szCs w:val="18"/>
+              </w:rPr>
+              <w:t>Built project management features with account and expenditure link.</w:t>
             </w:r>
           </w:p>
           <w:p>
@@ -4573,8 +4599,10 @@
               </w:numPr>
               <w:rPr>
                 <w:rFonts w:ascii="Inter" w:hAnsi="Inter"/>
-                <w:sz w:val="20"/>
-                <w:szCs w:val="20"/>
+                <w:i/>
+                <w:iCs/>
+                <w:sz w:val="18"/>
+                <w:szCs w:val="18"/>
               </w:rPr>
             </w:pPr>
             <w:r>
@@ -4584,52 +4612,134 @@
                 <w:bCs/>
                 <w:i/>
                 <w:iCs/>
-                <w:sz w:val="20"/>
-                <w:szCs w:val="20"/>
-              </w:rPr>
-              <w:t>Notification System</w:t>
+                <w:sz w:val="18"/>
+                <w:szCs w:val="18"/>
+              </w:rPr>
+              <w:t>Budget &amp; Financial Tracking</w:t>
             </w:r>
             <w:r>
               <w:rPr>
                 <w:rFonts w:ascii="Inter" w:hAnsi="Inter"/>
                 <w:i/>
                 <w:iCs/>
-                <w:sz w:val="20"/>
-                <w:szCs w:val="20"/>
+                <w:sz w:val="18"/>
+                <w:szCs w:val="18"/>
               </w:rPr>
               <w:br/>
             </w:r>
             <w:r>
               <w:rPr>
                 <w:rFonts w:ascii="Inter" w:hAnsi="Inter"/>
-                <w:sz w:val="20"/>
-                <w:szCs w:val="20"/>
+                <w:sz w:val="18"/>
+                <w:szCs w:val="18"/>
+              </w:rPr>
+              <w:t>Developed bulk import pipelines via Excel / CSV, with budget line tracking and reporting per KPI.</w:t>
+            </w:r>
+          </w:p>
+          <w:p>
+            <w:pPr>
+              <w:pStyle w:val="ListParagraph"/>
+              <w:numPr>
+                <w:ilvl w:val="1"/>
+                <w:numId w:val="3"/>
+              </w:numPr>
+              <w:rPr>
+                <w:rFonts w:ascii="Inter" w:hAnsi="Inter"/>
+                <w:i/>
+                <w:iCs/>
+                <w:sz w:val="18"/>
+                <w:szCs w:val="18"/>
+              </w:rPr>
+            </w:pPr>
+            <w:r>
+              <w:rPr>
+                <w:rFonts w:ascii="Inter" w:hAnsi="Inter"/>
+                <w:b/>
+                <w:bCs/>
+                <w:i/>
+                <w:iCs/>
+                <w:sz w:val="18"/>
+                <w:szCs w:val="18"/>
+              </w:rPr>
+              <w:t>Reporting &amp; Analytics</w:t>
+            </w:r>
+            <w:r>
+              <w:rPr>
+                <w:rFonts w:ascii="Inter" w:hAnsi="Inter"/>
+                <w:i/>
+                <w:iCs/>
+                <w:sz w:val="18"/>
+                <w:szCs w:val="18"/>
+              </w:rPr>
+              <w:br/>
+            </w:r>
+            <w:r>
+              <w:rPr>
+                <w:rFonts w:ascii="Inter" w:hAnsi="Inter"/>
+                <w:sz w:val="18"/>
+                <w:szCs w:val="18"/>
+              </w:rPr>
+              <w:t>Developed multi-format export (xlsx, pdf, docx) for KPA Performance Report</w:t>
+            </w:r>
+          </w:p>
+          <w:p>
+            <w:pPr>
+              <w:pStyle w:val="ListParagraph"/>
+              <w:numPr>
+                <w:ilvl w:val="1"/>
+                <w:numId w:val="3"/>
+              </w:numPr>
+              <w:rPr>
+                <w:rFonts w:ascii="Inter" w:hAnsi="Inter"/>
+                <w:sz w:val="18"/>
+                <w:szCs w:val="18"/>
+              </w:rPr>
+            </w:pPr>
+            <w:r>
+              <w:rPr>
+                <w:rFonts w:ascii="Inter" w:hAnsi="Inter"/>
+                <w:b/>
+                <w:bCs/>
+                <w:i/>
+                <w:iCs/>
+                <w:sz w:val="18"/>
+                <w:szCs w:val="18"/>
+              </w:rPr>
+              <w:t>Notification System</w:t>
+            </w:r>
+            <w:r>
+              <w:rPr>
+                <w:rFonts w:ascii="Inter" w:hAnsi="Inter"/>
+                <w:i/>
+                <w:iCs/>
+                <w:sz w:val="18"/>
+                <w:szCs w:val="18"/>
+              </w:rPr>
+              <w:br/>
+            </w:r>
+            <w:r>
+              <w:rPr>
+                <w:rFonts w:ascii="Inter" w:hAnsi="Inter"/>
+                <w:sz w:val="18"/>
+                <w:szCs w:val="18"/>
               </w:rPr>
               <w:t xml:space="preserve">Built a queue-based email delivery system architecture via Azure Service Bus with dynamic, tenant-specific email </w:t>
             </w:r>
             <w:r>
               <w:rPr>
                 <w:rFonts w:ascii="Inter" w:hAnsi="Inter"/>
-                <w:sz w:val="20"/>
-                <w:szCs w:val="20"/>
+                <w:sz w:val="18"/>
+                <w:szCs w:val="18"/>
               </w:rPr>
               <w:t>template for multi-tenant support, and triggers for approval, rejections, and submissions notification</w:t>
             </w:r>
             <w:r>
               <w:rPr>
                 <w:rFonts w:ascii="Inter" w:hAnsi="Inter"/>
-                <w:sz w:val="20"/>
-                <w:szCs w:val="20"/>
-              </w:rPr>
-              <w:t xml:space="preserve"> </w:t>
-            </w:r>
-            <w:r>
-              <w:rPr>
-                <w:rFonts w:ascii="Inter" w:hAnsi="Inter"/>
-                <w:sz w:val="20"/>
-                <w:szCs w:val="20"/>
-              </w:rPr>
-              <w:t>and a summary dashboard.</w:t>
+                <w:sz w:val="18"/>
+                <w:szCs w:val="18"/>
+              </w:rPr>
+              <w:t xml:space="preserve"> and a summary dashboard.</w:t>
             </w:r>
           </w:p>
           <w:p>
@@ -4641,8 +4751,8 @@
               </w:numPr>
               <w:rPr>
                 <w:rFonts w:ascii="Inter" w:hAnsi="Inter"/>
-                <w:sz w:val="20"/>
-                <w:szCs w:val="20"/>
+                <w:sz w:val="18"/>
+                <w:szCs w:val="18"/>
               </w:rPr>
             </w:pPr>
             <w:r>
@@ -4650,8 +4760,8 @@
                 <w:rFonts w:ascii="Inter" w:hAnsi="Inter"/>
                 <w:b/>
                 <w:bCs/>
-                <w:sz w:val="20"/>
-                <w:szCs w:val="20"/>
+                <w:sz w:val="18"/>
+                <w:szCs w:val="18"/>
               </w:rPr>
               <w:t>Workflow Module</w:t>
             </w:r>
@@ -4660,26 +4770,18 @@
                 <w:rFonts w:ascii="Inter" w:hAnsi="Inter"/>
                 <w:b/>
                 <w:bCs/>
-                <w:sz w:val="20"/>
-                <w:szCs w:val="20"/>
+                <w:sz w:val="18"/>
+                <w:szCs w:val="18"/>
               </w:rPr>
               <w:t xml:space="preserve"> </w:t>
             </w:r>
             <w:r>
               <w:rPr>
                 <w:rFonts w:ascii="Inter" w:hAnsi="Inter"/>
-                <w:sz w:val="20"/>
-                <w:szCs w:val="20"/>
-              </w:rPr>
-              <w:t xml:space="preserve">– </w:t>
-            </w:r>
-            <w:r>
-              <w:rPr>
-                <w:rFonts w:ascii="Inter" w:hAnsi="Inter"/>
-                <w:sz w:val="20"/>
-                <w:szCs w:val="20"/>
-              </w:rPr>
-              <w:t>a configurable, multi-tenant enterprise workflow management platform built in Angular for creating structured business processes with customizable approval chains, escalation policies, and incident tracking.</w:t>
+                <w:sz w:val="18"/>
+                <w:szCs w:val="18"/>
+              </w:rPr>
+              <w:t>– a configurable, multi-tenant enterprise workflow management platform built in Angular for creating structured business processes with customizable approval chains, escalation policies, and incident tracking.</w:t>
             </w:r>
           </w:p>
           <w:p>
@@ -4691,8 +4793,8 @@
               </w:numPr>
               <w:rPr>
                 <w:rFonts w:ascii="Inter" w:hAnsi="Inter"/>
-                <w:sz w:val="20"/>
-                <w:szCs w:val="20"/>
+                <w:sz w:val="18"/>
+                <w:szCs w:val="18"/>
               </w:rPr>
             </w:pPr>
             <w:r>
@@ -4702,16 +4804,16 @@
                 <w:bCs/>
                 <w:i/>
                 <w:iCs/>
-                <w:sz w:val="20"/>
-                <w:szCs w:val="20"/>
+                <w:sz w:val="18"/>
+                <w:szCs w:val="18"/>
               </w:rPr>
               <w:t>Workflow &amp; Step</w:t>
             </w:r>
             <w:r>
               <w:rPr>
                 <w:rFonts w:ascii="Inter" w:hAnsi="Inter"/>
-                <w:sz w:val="20"/>
-                <w:szCs w:val="20"/>
+                <w:sz w:val="18"/>
+                <w:szCs w:val="18"/>
               </w:rPr>
               <w:t xml:space="preserve"> </w:t>
             </w:r>
@@ -4722,8 +4824,8 @@
                 <w:bCs/>
                 <w:i/>
                 <w:iCs/>
-                <w:sz w:val="20"/>
-                <w:szCs w:val="20"/>
+                <w:sz w:val="18"/>
+                <w:szCs w:val="18"/>
               </w:rPr>
               <w:t>Management</w:t>
             </w:r>
@@ -4734,16 +4836,16 @@
                 <w:bCs/>
                 <w:i/>
                 <w:iCs/>
-                <w:sz w:val="20"/>
-                <w:szCs w:val="20"/>
+                <w:sz w:val="18"/>
+                <w:szCs w:val="18"/>
               </w:rPr>
               <w:br/>
             </w:r>
             <w:r>
               <w:rPr>
                 <w:rFonts w:ascii="Inter" w:hAnsi="Inter"/>
-                <w:sz w:val="20"/>
-                <w:szCs w:val="20"/>
+                <w:sz w:val="18"/>
+                <w:szCs w:val="18"/>
               </w:rPr>
               <w:t>Extended and enhanced CRUD functionality for configurable workflows and sequential approval steps with rejection routing, skip-step rules, and KPI editability per step.</w:t>
             </w:r>
@@ -4757,8 +4859,8 @@
               </w:numPr>
               <w:rPr>
                 <w:rFonts w:ascii="Inter" w:hAnsi="Inter"/>
-                <w:sz w:val="20"/>
-                <w:szCs w:val="20"/>
+                <w:sz w:val="18"/>
+                <w:szCs w:val="18"/>
               </w:rPr>
             </w:pPr>
             <w:r>
@@ -4768,25 +4870,18 @@
                 <w:bCs/>
                 <w:i/>
                 <w:iCs/>
-                <w:sz w:val="20"/>
-                <w:szCs w:val="20"/>
+                <w:sz w:val="18"/>
+                <w:szCs w:val="18"/>
               </w:rPr>
               <w:t>Escalation Configuration</w:t>
             </w:r>
             <w:r>
               <w:rPr>
                 <w:rFonts w:ascii="Inter" w:hAnsi="Inter"/>
-                <w:sz w:val="20"/>
-                <w:szCs w:val="20"/>
+                <w:sz w:val="18"/>
+                <w:szCs w:val="18"/>
               </w:rPr>
               <w:br/>
-            </w:r>
-            <w:r>
-              <w:rPr>
-                <w:rFonts w:ascii="Inter" w:hAnsi="Inter"/>
-                <w:sz w:val="20"/>
-                <w:szCs w:val="20"/>
-              </w:rPr>
               <w:t>Developed an escalation configuration feature for defining and managing escalation groups with configurable details and deadlines.</w:t>
             </w:r>
           </w:p>
@@ -4799,8 +4894,8 @@
               </w:numPr>
               <w:rPr>
                 <w:rFonts w:ascii="Inter" w:hAnsi="Inter"/>
-                <w:sz w:val="20"/>
-                <w:szCs w:val="20"/>
+                <w:sz w:val="18"/>
+                <w:szCs w:val="18"/>
               </w:rPr>
             </w:pPr>
             <w:r>
@@ -4810,25 +4905,18 @@
                 <w:bCs/>
                 <w:i/>
                 <w:iCs/>
-                <w:sz w:val="20"/>
-                <w:szCs w:val="20"/>
+                <w:sz w:val="18"/>
+                <w:szCs w:val="18"/>
               </w:rPr>
               <w:t>Incident Management</w:t>
             </w:r>
             <w:r>
               <w:rPr>
                 <w:rFonts w:ascii="Inter" w:hAnsi="Inter"/>
-                <w:sz w:val="20"/>
-                <w:szCs w:val="20"/>
+                <w:sz w:val="18"/>
+                <w:szCs w:val="18"/>
               </w:rPr>
               <w:br/>
-            </w:r>
-            <w:r>
-              <w:rPr>
-                <w:rFonts w:ascii="Inter" w:hAnsi="Inter"/>
-                <w:sz w:val="20"/>
-                <w:szCs w:val="20"/>
-              </w:rPr>
               <w:t>Enhanced the incident management UI and implemented workflow integration for incident types, enabling incident categories to be linked to specific approval chains.</w:t>
             </w:r>
           </w:p>
@@ -4840,8 +4928,8 @@
               </w:numPr>
               <w:rPr>
                 <w:rFonts w:ascii="Inter" w:hAnsi="Inter"/>
-                <w:sz w:val="20"/>
-                <w:szCs w:val="20"/>
+                <w:sz w:val="18"/>
+                <w:szCs w:val="18"/>
               </w:rPr>
             </w:pPr>
             <w:r>
@@ -4849,38 +4937,18 @@
                 <w:rFonts w:ascii="Inter" w:hAnsi="Inter"/>
                 <w:b/>
                 <w:bCs/>
-                <w:sz w:val="20"/>
-                <w:szCs w:val="20"/>
-              </w:rPr>
-              <w:t>Risk Management System</w:t>
-            </w:r>
-            <w:r>
-              <w:rPr>
-                <w:rFonts w:ascii="Inter" w:hAnsi="Inter"/>
-                <w:b/>
-                <w:bCs/>
-                <w:sz w:val="20"/>
-                <w:szCs w:val="20"/>
-              </w:rPr>
-              <w:t xml:space="preserve"> </w:t>
-            </w:r>
-            <w:r>
-              <w:rPr>
-                <w:rFonts w:ascii="Inter" w:hAnsi="Inter"/>
-                <w:b/>
-                <w:bCs/>
-                <w:sz w:val="20"/>
-                <w:szCs w:val="20"/>
-              </w:rPr>
-              <w:t>(RMS)</w:t>
-            </w:r>
-          </w:p>
-          <w:p>
-            <w:pPr>
-              <w:rPr>
-                <w:rFonts w:ascii="Inter" w:hAnsi="Inter"/>
-                <w:sz w:val="20"/>
-                <w:szCs w:val="20"/>
+                <w:sz w:val="18"/>
+                <w:szCs w:val="18"/>
+              </w:rPr>
+              <w:t>Risk Management System (RMS)</w:t>
+            </w:r>
+          </w:p>
+          <w:p>
+            <w:pPr>
+              <w:rPr>
+                <w:rFonts w:ascii="Inter" w:hAnsi="Inter"/>
+                <w:sz w:val="18"/>
+                <w:szCs w:val="18"/>
               </w:rPr>
             </w:pPr>
           </w:p>

</xml_diff>